<commit_message>
Modified Jenkins task 2
</commit_message>
<xml_diff>
--- a/Jenkins Task - 2.docx
+++ b/Jenkins Task - 2.docx
@@ -41,6 +41,1706 @@
         </w:rPr>
         <w:t xml:space="preserve">Step 1: </w:t>
       </w:r>
+      <w:r>
+        <w:rPr>
+          <w:sz w:val="28"/>
+          <w:szCs w:val="28"/>
+        </w:rPr>
+        <w:t>Launch 2 instances named slave-01 and 02, also enter bash script in user data to install java.</w:t>
+      </w:r>
+    </w:p>
+    <w:p>
+      <w:pPr>
+        <w:pStyle w:val="ListParagraph"/>
+        <w:spacing w:before="240" w:after="0"/>
+        <w:ind w:left="142"/>
+        <w:rPr>
+          <w:sz w:val="28"/>
+          <w:szCs w:val="28"/>
+        </w:rPr>
+      </w:pPr>
+      <w:r>
+        <w:rPr>
+          <w:sz w:val="28"/>
+          <w:szCs w:val="28"/>
+        </w:rPr>
+        <w:drawing>
+          <wp:inline distT="0" distB="0" distL="0" distR="0" wp14:anchorId="0EB5C048" wp14:editId="28DB87F5">
+            <wp:extent cx="7139354" cy="2444479"/>
+            <wp:effectExtent l="0" t="0" r="4445" b="0"/>
+            <wp:docPr id="1809927814" name="Picture 1"/>
+            <wp:cNvGraphicFramePr>
+              <a:graphicFrameLocks xmlns:a="http://schemas.openxmlformats.org/drawingml/2006/main" noChangeAspect="1"/>
+            </wp:cNvGraphicFramePr>
+            <a:graphic xmlns:a="http://schemas.openxmlformats.org/drawingml/2006/main">
+              <a:graphicData uri="http://schemas.openxmlformats.org/drawingml/2006/picture">
+                <pic:pic xmlns:pic="http://schemas.openxmlformats.org/drawingml/2006/picture">
+                  <pic:nvPicPr>
+                    <pic:cNvPr id="1809927814" name=""/>
+                    <pic:cNvPicPr/>
+                  </pic:nvPicPr>
+                  <pic:blipFill>
+                    <a:blip r:embed="rId5"/>
+                    <a:stretch>
+                      <a:fillRect/>
+                    </a:stretch>
+                  </pic:blipFill>
+                  <pic:spPr>
+                    <a:xfrm>
+                      <a:off x="0" y="0"/>
+                      <a:ext cx="7147425" cy="2447242"/>
+                    </a:xfrm>
+                    <a:prstGeom prst="rect">
+                      <a:avLst/>
+                    </a:prstGeom>
+                  </pic:spPr>
+                </pic:pic>
+              </a:graphicData>
+            </a:graphic>
+          </wp:inline>
+        </w:drawing>
+      </w:r>
+    </w:p>
+    <w:p>
+      <w:pPr>
+        <w:pStyle w:val="ListParagraph"/>
+        <w:spacing w:before="240" w:after="0"/>
+        <w:ind w:left="142"/>
+        <w:rPr>
+          <w:sz w:val="28"/>
+          <w:szCs w:val="28"/>
+        </w:rPr>
+      </w:pPr>
+      <w:r>
+        <w:rPr>
+          <w:sz w:val="28"/>
+          <w:szCs w:val="28"/>
+        </w:rPr>
+        <w:t xml:space="preserve"> </w:t>
+      </w:r>
+      <w:r>
+        <w:rPr>
+          <w:sz w:val="28"/>
+          <w:szCs w:val="28"/>
+        </w:rPr>
+        <w:drawing>
+          <wp:inline distT="0" distB="0" distL="0" distR="0" wp14:anchorId="5BCEB5AB" wp14:editId="62B97818">
+            <wp:extent cx="7098323" cy="1914422"/>
+            <wp:effectExtent l="0" t="0" r="7620" b="0"/>
+            <wp:docPr id="1866745109" name="Picture 1"/>
+            <wp:cNvGraphicFramePr>
+              <a:graphicFrameLocks xmlns:a="http://schemas.openxmlformats.org/drawingml/2006/main" noChangeAspect="1"/>
+            </wp:cNvGraphicFramePr>
+            <a:graphic xmlns:a="http://schemas.openxmlformats.org/drawingml/2006/main">
+              <a:graphicData uri="http://schemas.openxmlformats.org/drawingml/2006/picture">
+                <pic:pic xmlns:pic="http://schemas.openxmlformats.org/drawingml/2006/picture">
+                  <pic:nvPicPr>
+                    <pic:cNvPr id="1866745109" name=""/>
+                    <pic:cNvPicPr/>
+                  </pic:nvPicPr>
+                  <pic:blipFill>
+                    <a:blip r:embed="rId6"/>
+                    <a:stretch>
+                      <a:fillRect/>
+                    </a:stretch>
+                  </pic:blipFill>
+                  <pic:spPr>
+                    <a:xfrm>
+                      <a:off x="0" y="0"/>
+                      <a:ext cx="7132315" cy="1923590"/>
+                    </a:xfrm>
+                    <a:prstGeom prst="rect">
+                      <a:avLst/>
+                    </a:prstGeom>
+                  </pic:spPr>
+                </pic:pic>
+              </a:graphicData>
+            </a:graphic>
+          </wp:inline>
+        </w:drawing>
+      </w:r>
+    </w:p>
+    <w:p>
+      <w:pPr>
+        <w:pStyle w:val="ListParagraph"/>
+        <w:spacing w:before="240" w:after="0"/>
+        <w:ind w:left="142"/>
+        <w:rPr>
+          <w:sz w:val="28"/>
+          <w:szCs w:val="28"/>
+        </w:rPr>
+      </w:pPr>
+      <w:r>
+        <w:rPr>
+          <w:sz w:val="28"/>
+          <w:szCs w:val="28"/>
+        </w:rPr>
+        <w:drawing>
+          <wp:inline distT="0" distB="0" distL="0" distR="0" wp14:anchorId="3966C3E1" wp14:editId="3F568C4B">
+            <wp:extent cx="7381240" cy="1188720"/>
+            <wp:effectExtent l="0" t="0" r="0" b="0"/>
+            <wp:docPr id="198254813" name="Picture 1"/>
+            <wp:cNvGraphicFramePr>
+              <a:graphicFrameLocks xmlns:a="http://schemas.openxmlformats.org/drawingml/2006/main" noChangeAspect="1"/>
+            </wp:cNvGraphicFramePr>
+            <a:graphic xmlns:a="http://schemas.openxmlformats.org/drawingml/2006/main">
+              <a:graphicData uri="http://schemas.openxmlformats.org/drawingml/2006/picture">
+                <pic:pic xmlns:pic="http://schemas.openxmlformats.org/drawingml/2006/picture">
+                  <pic:nvPicPr>
+                    <pic:cNvPr id="198254813" name=""/>
+                    <pic:cNvPicPr/>
+                  </pic:nvPicPr>
+                  <pic:blipFill>
+                    <a:blip r:embed="rId7"/>
+                    <a:stretch>
+                      <a:fillRect/>
+                    </a:stretch>
+                  </pic:blipFill>
+                  <pic:spPr>
+                    <a:xfrm>
+                      <a:off x="0" y="0"/>
+                      <a:ext cx="7381240" cy="1188720"/>
+                    </a:xfrm>
+                    <a:prstGeom prst="rect">
+                      <a:avLst/>
+                    </a:prstGeom>
+                  </pic:spPr>
+                </pic:pic>
+              </a:graphicData>
+            </a:graphic>
+          </wp:inline>
+        </w:drawing>
+      </w:r>
+    </w:p>
+    <w:p>
+      <w:pPr>
+        <w:pStyle w:val="ListParagraph"/>
+        <w:spacing w:before="240" w:after="0"/>
+        <w:ind w:left="142"/>
+        <w:rPr>
+          <w:sz w:val="28"/>
+          <w:szCs w:val="28"/>
+        </w:rPr>
+      </w:pPr>
+      <w:r>
+        <w:rPr>
+          <w:sz w:val="28"/>
+          <w:szCs w:val="28"/>
+        </w:rPr>
+        <w:t xml:space="preserve">Step 2: Login to </w:t>
+      </w:r>
+      <w:r>
+        <w:rPr>
+          <w:sz w:val="28"/>
+          <w:szCs w:val="28"/>
+        </w:rPr>
+        <w:t>slave-01</w:t>
+      </w:r>
+      <w:r>
+        <w:rPr>
+          <w:sz w:val="28"/>
+          <w:szCs w:val="28"/>
+        </w:rPr>
+        <w:t xml:space="preserve"> instance and do following steps to configure to master.</w:t>
+      </w:r>
+    </w:p>
+    <w:p>
+      <w:pPr>
+        <w:pStyle w:val="ListParagraph"/>
+        <w:spacing w:before="240" w:after="0"/>
+        <w:ind w:firstLine="720"/>
+        <w:rPr>
+          <w:b/>
+          <w:bCs/>
+          <w:sz w:val="28"/>
+          <w:szCs w:val="28"/>
+        </w:rPr>
+      </w:pPr>
+      <w:r>
+        <w:rPr>
+          <w:b/>
+          <w:bCs/>
+          <w:sz w:val="28"/>
+          <w:szCs w:val="28"/>
+        </w:rPr>
+        <w:t>Steps to be done on slave</w:t>
+      </w:r>
+    </w:p>
+    <w:p>
+      <w:pPr>
+        <w:pStyle w:val="ListParagraph"/>
+        <w:numPr>
+          <w:ilvl w:val="0"/>
+          <w:numId w:val="2"/>
+        </w:numPr>
+        <w:spacing w:before="240" w:after="0"/>
+        <w:rPr>
+          <w:sz w:val="28"/>
+          <w:szCs w:val="28"/>
+        </w:rPr>
+      </w:pPr>
+      <w:r>
+        <w:rPr>
+          <w:sz w:val="28"/>
+          <w:szCs w:val="28"/>
+        </w:rPr>
+        <w:t xml:space="preserve">Login to slave </w:t>
+      </w:r>
+      <w:proofErr w:type="gramStart"/>
+      <w:r>
+        <w:rPr>
+          <w:sz w:val="28"/>
+          <w:szCs w:val="28"/>
+        </w:rPr>
+        <w:t>machine..</w:t>
+      </w:r>
+      <w:proofErr w:type="gramEnd"/>
+    </w:p>
+    <w:p>
+      <w:pPr>
+        <w:pStyle w:val="ListParagraph"/>
+        <w:numPr>
+          <w:ilvl w:val="0"/>
+          <w:numId w:val="2"/>
+        </w:numPr>
+        <w:spacing w:before="240" w:after="0"/>
+        <w:rPr>
+          <w:sz w:val="28"/>
+          <w:szCs w:val="28"/>
+        </w:rPr>
+      </w:pPr>
+      <w:r>
+        <w:rPr>
+          <w:sz w:val="28"/>
+          <w:szCs w:val="28"/>
+        </w:rPr>
+        <w:t>switch to root user</w:t>
+      </w:r>
+    </w:p>
+    <w:p>
+      <w:pPr>
+        <w:pStyle w:val="ListParagraph"/>
+        <w:numPr>
+          <w:ilvl w:val="0"/>
+          <w:numId w:val="2"/>
+        </w:numPr>
+        <w:spacing w:before="240" w:after="0"/>
+        <w:rPr>
+          <w:sz w:val="28"/>
+          <w:szCs w:val="28"/>
+        </w:rPr>
+      </w:pPr>
+      <w:r>
+        <w:rPr>
+          <w:sz w:val="28"/>
+          <w:szCs w:val="28"/>
+        </w:rPr>
+        <w:t>Create ssh-keygen</w:t>
+      </w:r>
+    </w:p>
+    <w:p>
+      <w:pPr>
+        <w:pStyle w:val="ListParagraph"/>
+        <w:numPr>
+          <w:ilvl w:val="0"/>
+          <w:numId w:val="2"/>
+        </w:numPr>
+        <w:spacing w:before="240" w:after="0"/>
+        <w:rPr>
+          <w:sz w:val="28"/>
+          <w:szCs w:val="28"/>
+        </w:rPr>
+      </w:pPr>
+      <w:r>
+        <w:rPr>
+          <w:sz w:val="28"/>
+          <w:szCs w:val="28"/>
+        </w:rPr>
+        <w:t xml:space="preserve">cat id_rsa.pub &gt; </w:t>
+      </w:r>
+      <w:proofErr w:type="spellStart"/>
+      <w:r>
+        <w:rPr>
+          <w:sz w:val="28"/>
+          <w:szCs w:val="28"/>
+        </w:rPr>
+        <w:t>authorized_keys</w:t>
+      </w:r>
+      <w:proofErr w:type="spellEnd"/>
+    </w:p>
+    <w:p>
+      <w:pPr>
+        <w:pStyle w:val="ListParagraph"/>
+        <w:numPr>
+          <w:ilvl w:val="0"/>
+          <w:numId w:val="2"/>
+        </w:numPr>
+        <w:spacing w:after="0"/>
+        <w:rPr>
+          <w:sz w:val="28"/>
+          <w:szCs w:val="28"/>
+        </w:rPr>
+      </w:pPr>
+      <w:proofErr w:type="spellStart"/>
+      <w:r>
+        <w:rPr>
+          <w:sz w:val="28"/>
+          <w:szCs w:val="28"/>
+        </w:rPr>
+        <w:t>chmod</w:t>
+      </w:r>
+      <w:proofErr w:type="spellEnd"/>
+      <w:r>
+        <w:rPr>
+          <w:sz w:val="28"/>
+          <w:szCs w:val="28"/>
+        </w:rPr>
+        <w:t xml:space="preserve"> 700 </w:t>
+      </w:r>
+      <w:proofErr w:type="spellStart"/>
+      <w:r>
+        <w:rPr>
+          <w:sz w:val="28"/>
+          <w:szCs w:val="28"/>
+        </w:rPr>
+        <w:t>authorized_keys</w:t>
+      </w:r>
+      <w:proofErr w:type="spellEnd"/>
+    </w:p>
+    <w:p>
+      <w:pPr>
+        <w:spacing w:after="0"/>
+        <w:rPr>
+          <w:sz w:val="28"/>
+          <w:szCs w:val="28"/>
+        </w:rPr>
+      </w:pPr>
+      <w:r>
+        <w:rPr>
+          <w:sz w:val="28"/>
+          <w:szCs w:val="28"/>
+        </w:rPr>
+        <w:drawing>
+          <wp:inline distT="0" distB="0" distL="0" distR="0" wp14:anchorId="2868B3AB" wp14:editId="26F1D15C">
+            <wp:extent cx="7381240" cy="2070735"/>
+            <wp:effectExtent l="0" t="0" r="0" b="5715"/>
+            <wp:docPr id="1395720282" name="Picture 1"/>
+            <wp:cNvGraphicFramePr>
+              <a:graphicFrameLocks xmlns:a="http://schemas.openxmlformats.org/drawingml/2006/main" noChangeAspect="1"/>
+            </wp:cNvGraphicFramePr>
+            <a:graphic xmlns:a="http://schemas.openxmlformats.org/drawingml/2006/main">
+              <a:graphicData uri="http://schemas.openxmlformats.org/drawingml/2006/picture">
+                <pic:pic xmlns:pic="http://schemas.openxmlformats.org/drawingml/2006/picture">
+                  <pic:nvPicPr>
+                    <pic:cNvPr id="1395720282" name=""/>
+                    <pic:cNvPicPr/>
+                  </pic:nvPicPr>
+                  <pic:blipFill>
+                    <a:blip r:embed="rId8"/>
+                    <a:stretch>
+                      <a:fillRect/>
+                    </a:stretch>
+                  </pic:blipFill>
+                  <pic:spPr>
+                    <a:xfrm>
+                      <a:off x="0" y="0"/>
+                      <a:ext cx="7381240" cy="2070735"/>
+                    </a:xfrm>
+                    <a:prstGeom prst="rect">
+                      <a:avLst/>
+                    </a:prstGeom>
+                  </pic:spPr>
+                </pic:pic>
+              </a:graphicData>
+            </a:graphic>
+          </wp:inline>
+        </w:drawing>
+      </w:r>
+    </w:p>
+    <w:p>
+      <w:pPr>
+        <w:spacing w:after="0"/>
+        <w:rPr>
+          <w:sz w:val="28"/>
+          <w:szCs w:val="28"/>
+        </w:rPr>
+      </w:pPr>
+    </w:p>
+    <w:p>
+      <w:pPr>
+        <w:spacing w:after="0"/>
+        <w:rPr>
+          <w:sz w:val="28"/>
+          <w:szCs w:val="28"/>
+        </w:rPr>
+      </w:pPr>
+      <w:r>
+        <w:rPr>
+          <w:sz w:val="28"/>
+          <w:szCs w:val="28"/>
+        </w:rPr>
+        <w:lastRenderedPageBreak/>
+        <w:drawing>
+          <wp:inline distT="0" distB="0" distL="0" distR="0" wp14:anchorId="4F7D1793" wp14:editId="62103B75">
+            <wp:extent cx="7381240" cy="2766695"/>
+            <wp:effectExtent l="0" t="0" r="0" b="0"/>
+            <wp:docPr id="675856140" name="Picture 1"/>
+            <wp:cNvGraphicFramePr>
+              <a:graphicFrameLocks xmlns:a="http://schemas.openxmlformats.org/drawingml/2006/main" noChangeAspect="1"/>
+            </wp:cNvGraphicFramePr>
+            <a:graphic xmlns:a="http://schemas.openxmlformats.org/drawingml/2006/main">
+              <a:graphicData uri="http://schemas.openxmlformats.org/drawingml/2006/picture">
+                <pic:pic xmlns:pic="http://schemas.openxmlformats.org/drawingml/2006/picture">
+                  <pic:nvPicPr>
+                    <pic:cNvPr id="675856140" name=""/>
+                    <pic:cNvPicPr/>
+                  </pic:nvPicPr>
+                  <pic:blipFill>
+                    <a:blip r:embed="rId9"/>
+                    <a:stretch>
+                      <a:fillRect/>
+                    </a:stretch>
+                  </pic:blipFill>
+                  <pic:spPr>
+                    <a:xfrm>
+                      <a:off x="0" y="0"/>
+                      <a:ext cx="7381240" cy="2766695"/>
+                    </a:xfrm>
+                    <a:prstGeom prst="rect">
+                      <a:avLst/>
+                    </a:prstGeom>
+                  </pic:spPr>
+                </pic:pic>
+              </a:graphicData>
+            </a:graphic>
+          </wp:inline>
+        </w:drawing>
+      </w:r>
+    </w:p>
+    <w:p>
+      <w:pPr>
+        <w:spacing w:after="0"/>
+        <w:rPr>
+          <w:sz w:val="28"/>
+          <w:szCs w:val="28"/>
+        </w:rPr>
+      </w:pPr>
+    </w:p>
+    <w:p>
+      <w:pPr>
+        <w:spacing w:after="0"/>
+        <w:rPr>
+          <w:b/>
+          <w:bCs/>
+          <w:sz w:val="28"/>
+          <w:szCs w:val="28"/>
+        </w:rPr>
+      </w:pPr>
+      <w:r>
+        <w:rPr>
+          <w:sz w:val="28"/>
+          <w:szCs w:val="28"/>
+        </w:rPr>
+        <w:t xml:space="preserve">        </w:t>
+      </w:r>
+      <w:r>
+        <w:rPr>
+          <w:b/>
+          <w:bCs/>
+          <w:sz w:val="28"/>
+          <w:szCs w:val="28"/>
+        </w:rPr>
+        <w:t>Steps to be done on master machine:</w:t>
+      </w:r>
+    </w:p>
+    <w:p>
+      <w:pPr>
+        <w:pStyle w:val="ListParagraph"/>
+        <w:numPr>
+          <w:ilvl w:val="0"/>
+          <w:numId w:val="3"/>
+        </w:numPr>
+        <w:spacing w:after="0"/>
+        <w:rPr>
+          <w:sz w:val="28"/>
+          <w:szCs w:val="28"/>
+        </w:rPr>
+      </w:pPr>
+      <w:r>
+        <w:rPr>
+          <w:sz w:val="28"/>
+          <w:szCs w:val="28"/>
+        </w:rPr>
+        <w:t>Login to master machine</w:t>
+      </w:r>
+    </w:p>
+    <w:p>
+      <w:pPr>
+        <w:pStyle w:val="ListParagraph"/>
+        <w:numPr>
+          <w:ilvl w:val="0"/>
+          <w:numId w:val="3"/>
+        </w:numPr>
+        <w:spacing w:after="0"/>
+        <w:rPr>
+          <w:sz w:val="28"/>
+          <w:szCs w:val="28"/>
+        </w:rPr>
+      </w:pPr>
+      <w:r>
+        <w:rPr>
+          <w:sz w:val="28"/>
+          <w:szCs w:val="28"/>
+        </w:rPr>
+        <w:t>switch to root user.</w:t>
+      </w:r>
+    </w:p>
+    <w:p>
+      <w:pPr>
+        <w:pStyle w:val="ListParagraph"/>
+        <w:numPr>
+          <w:ilvl w:val="0"/>
+          <w:numId w:val="3"/>
+        </w:numPr>
+        <w:spacing w:after="0"/>
+        <w:rPr>
+          <w:sz w:val="28"/>
+          <w:szCs w:val="28"/>
+        </w:rPr>
+      </w:pPr>
+      <w:proofErr w:type="spellStart"/>
+      <w:r>
+        <w:rPr>
+          <w:sz w:val="28"/>
+          <w:szCs w:val="28"/>
+        </w:rPr>
+        <w:t>mkdir</w:t>
+      </w:r>
+      <w:proofErr w:type="spellEnd"/>
+      <w:r>
+        <w:rPr>
+          <w:sz w:val="28"/>
+          <w:szCs w:val="28"/>
+        </w:rPr>
+        <w:t xml:space="preserve"> -p /var/lib/</w:t>
+      </w:r>
+      <w:proofErr w:type="spellStart"/>
+      <w:r>
+        <w:rPr>
+          <w:sz w:val="28"/>
+          <w:szCs w:val="28"/>
+        </w:rPr>
+        <w:t>jenkins</w:t>
+      </w:r>
+      <w:proofErr w:type="spellEnd"/>
+      <w:r>
+        <w:rPr>
+          <w:sz w:val="28"/>
+          <w:szCs w:val="28"/>
+        </w:rPr>
+        <w:t>/.ssh</w:t>
+      </w:r>
+    </w:p>
+    <w:p>
+      <w:pPr>
+        <w:pStyle w:val="ListParagraph"/>
+        <w:numPr>
+          <w:ilvl w:val="0"/>
+          <w:numId w:val="3"/>
+        </w:numPr>
+        <w:spacing w:after="0"/>
+        <w:rPr>
+          <w:sz w:val="28"/>
+          <w:szCs w:val="28"/>
+        </w:rPr>
+      </w:pPr>
+      <w:r>
+        <w:rPr>
+          <w:sz w:val="28"/>
+          <w:szCs w:val="28"/>
+        </w:rPr>
+        <w:t>cd /var/lib/</w:t>
+      </w:r>
+      <w:proofErr w:type="spellStart"/>
+      <w:r>
+        <w:rPr>
+          <w:sz w:val="28"/>
+          <w:szCs w:val="28"/>
+        </w:rPr>
+        <w:t>jenkins</w:t>
+      </w:r>
+      <w:proofErr w:type="spellEnd"/>
+      <w:r>
+        <w:rPr>
+          <w:sz w:val="28"/>
+          <w:szCs w:val="28"/>
+        </w:rPr>
+        <w:t>/.ssh</w:t>
+      </w:r>
+    </w:p>
+    <w:p>
+      <w:pPr>
+        <w:pStyle w:val="ListParagraph"/>
+        <w:numPr>
+          <w:ilvl w:val="0"/>
+          <w:numId w:val="3"/>
+        </w:numPr>
+        <w:spacing w:after="0"/>
+        <w:rPr>
+          <w:sz w:val="28"/>
+          <w:szCs w:val="28"/>
+        </w:rPr>
+      </w:pPr>
+      <w:r>
+        <w:rPr>
+          <w:sz w:val="28"/>
+          <w:szCs w:val="28"/>
+        </w:rPr>
+        <w:t>ssh-</w:t>
+      </w:r>
+      <w:proofErr w:type="spellStart"/>
+      <w:r>
+        <w:rPr>
+          <w:sz w:val="28"/>
+          <w:szCs w:val="28"/>
+        </w:rPr>
+        <w:t>keyscan</w:t>
+      </w:r>
+      <w:proofErr w:type="spellEnd"/>
+      <w:r>
+        <w:rPr>
+          <w:sz w:val="28"/>
+          <w:szCs w:val="28"/>
+        </w:rPr>
+        <w:t xml:space="preserve"> -H SLAVE-NODE-IP-OR-HOSTNAME &gt;&gt;/var/lib/</w:t>
+      </w:r>
+      <w:proofErr w:type="spellStart"/>
+      <w:r>
+        <w:rPr>
+          <w:sz w:val="28"/>
+          <w:szCs w:val="28"/>
+        </w:rPr>
+        <w:t>jenkins</w:t>
+      </w:r>
+      <w:proofErr w:type="spellEnd"/>
+      <w:r>
+        <w:rPr>
+          <w:sz w:val="28"/>
+          <w:szCs w:val="28"/>
+        </w:rPr>
+        <w:t>/.ssh/</w:t>
+      </w:r>
+      <w:proofErr w:type="spellStart"/>
+      <w:r>
+        <w:rPr>
+          <w:sz w:val="28"/>
+          <w:szCs w:val="28"/>
+        </w:rPr>
+        <w:t>known_hosts</w:t>
+      </w:r>
+      <w:proofErr w:type="spellEnd"/>
+    </w:p>
+    <w:p>
+      <w:pPr>
+        <w:pStyle w:val="ListParagraph"/>
+        <w:numPr>
+          <w:ilvl w:val="0"/>
+          <w:numId w:val="3"/>
+        </w:numPr>
+        <w:spacing w:after="0"/>
+        <w:rPr>
+          <w:sz w:val="28"/>
+          <w:szCs w:val="28"/>
+        </w:rPr>
+      </w:pPr>
+      <w:r>
+        <w:rPr>
+          <w:sz w:val="28"/>
+          <w:szCs w:val="28"/>
+        </w:rPr>
+        <w:t># ssh-</w:t>
+      </w:r>
+      <w:proofErr w:type="spellStart"/>
+      <w:r>
+        <w:rPr>
+          <w:sz w:val="28"/>
+          <w:szCs w:val="28"/>
+        </w:rPr>
+        <w:t>keyscan</w:t>
+      </w:r>
+      <w:proofErr w:type="spellEnd"/>
+      <w:r>
+        <w:rPr>
+          <w:sz w:val="28"/>
+          <w:szCs w:val="28"/>
+        </w:rPr>
+        <w:t xml:space="preserve"> -H 172.31.38.42 &gt;&gt;/var/lib/</w:t>
+      </w:r>
+      <w:proofErr w:type="spellStart"/>
+      <w:r>
+        <w:rPr>
+          <w:sz w:val="28"/>
+          <w:szCs w:val="28"/>
+        </w:rPr>
+        <w:t>jenkins</w:t>
+      </w:r>
+      <w:proofErr w:type="spellEnd"/>
+      <w:r>
+        <w:rPr>
+          <w:sz w:val="28"/>
+          <w:szCs w:val="28"/>
+        </w:rPr>
+        <w:t>/.ssh/</w:t>
+      </w:r>
+      <w:proofErr w:type="spellStart"/>
+      <w:r>
+        <w:rPr>
+          <w:sz w:val="28"/>
+          <w:szCs w:val="28"/>
+        </w:rPr>
+        <w:t>known_hosts</w:t>
+      </w:r>
+      <w:proofErr w:type="spellEnd"/>
+    </w:p>
+    <w:p>
+      <w:pPr>
+        <w:pStyle w:val="ListParagraph"/>
+        <w:numPr>
+          <w:ilvl w:val="0"/>
+          <w:numId w:val="3"/>
+        </w:numPr>
+        <w:spacing w:after="0"/>
+        <w:rPr>
+          <w:sz w:val="28"/>
+          <w:szCs w:val="28"/>
+        </w:rPr>
+      </w:pPr>
+      <w:proofErr w:type="spellStart"/>
+      <w:r>
+        <w:rPr>
+          <w:sz w:val="28"/>
+          <w:szCs w:val="28"/>
+        </w:rPr>
+        <w:t>chown</w:t>
+      </w:r>
+      <w:proofErr w:type="spellEnd"/>
+      <w:r>
+        <w:rPr>
+          <w:sz w:val="28"/>
+          <w:szCs w:val="28"/>
+        </w:rPr>
+        <w:t xml:space="preserve"> </w:t>
+      </w:r>
+      <w:proofErr w:type="spellStart"/>
+      <w:proofErr w:type="gramStart"/>
+      <w:r>
+        <w:rPr>
+          <w:sz w:val="28"/>
+          <w:szCs w:val="28"/>
+        </w:rPr>
+        <w:t>jenkins:jenkins</w:t>
+      </w:r>
+      <w:proofErr w:type="spellEnd"/>
+      <w:proofErr w:type="gramEnd"/>
+      <w:r>
+        <w:rPr>
+          <w:sz w:val="28"/>
+          <w:szCs w:val="28"/>
+        </w:rPr>
+        <w:t xml:space="preserve"> </w:t>
+      </w:r>
+      <w:proofErr w:type="spellStart"/>
+      <w:r>
+        <w:rPr>
+          <w:sz w:val="28"/>
+          <w:szCs w:val="28"/>
+        </w:rPr>
+        <w:t>known_hosts</w:t>
+      </w:r>
+      <w:proofErr w:type="spellEnd"/>
+    </w:p>
+    <w:p>
+      <w:pPr>
+        <w:pStyle w:val="ListParagraph"/>
+        <w:numPr>
+          <w:ilvl w:val="0"/>
+          <w:numId w:val="3"/>
+        </w:numPr>
+        <w:spacing w:after="0"/>
+        <w:rPr>
+          <w:sz w:val="28"/>
+          <w:szCs w:val="28"/>
+        </w:rPr>
+      </w:pPr>
+      <w:r>
+        <w:rPr>
+          <w:sz w:val="28"/>
+          <w:szCs w:val="28"/>
+        </w:rPr>
+        <w:t>#we need to change the owner as we ran ssh-</w:t>
+      </w:r>
+      <w:proofErr w:type="spellStart"/>
+      <w:r>
+        <w:rPr>
+          <w:sz w:val="28"/>
+          <w:szCs w:val="28"/>
+        </w:rPr>
+        <w:t>keyscan</w:t>
+      </w:r>
+      <w:proofErr w:type="spellEnd"/>
+      <w:r>
+        <w:rPr>
+          <w:sz w:val="28"/>
+          <w:szCs w:val="28"/>
+        </w:rPr>
+        <w:t xml:space="preserve"> command using “root” user.</w:t>
+      </w:r>
+    </w:p>
+    <w:p>
+      <w:pPr>
+        <w:pStyle w:val="ListParagraph"/>
+        <w:numPr>
+          <w:ilvl w:val="0"/>
+          <w:numId w:val="3"/>
+        </w:numPr>
+        <w:spacing w:after="0"/>
+        <w:rPr>
+          <w:sz w:val="28"/>
+          <w:szCs w:val="28"/>
+        </w:rPr>
+      </w:pPr>
+      <w:r>
+        <w:rPr>
+          <w:sz w:val="28"/>
+          <w:szCs w:val="28"/>
+        </w:rPr>
+        <w:t># default user of Jenkins will be “</w:t>
+      </w:r>
+      <w:proofErr w:type="spellStart"/>
+      <w:r>
+        <w:rPr>
+          <w:sz w:val="28"/>
+          <w:szCs w:val="28"/>
+        </w:rPr>
+        <w:t>jenkins</w:t>
+      </w:r>
+      <w:proofErr w:type="spellEnd"/>
+      <w:r>
+        <w:rPr>
+          <w:sz w:val="28"/>
+          <w:szCs w:val="28"/>
+        </w:rPr>
+        <w:t>”</w:t>
+      </w:r>
+    </w:p>
+    <w:p>
+      <w:pPr>
+        <w:pStyle w:val="ListParagraph"/>
+        <w:numPr>
+          <w:ilvl w:val="0"/>
+          <w:numId w:val="3"/>
+        </w:numPr>
+        <w:spacing w:after="0"/>
+        <w:rPr>
+          <w:sz w:val="28"/>
+          <w:szCs w:val="28"/>
+        </w:rPr>
+      </w:pPr>
+      <w:proofErr w:type="spellStart"/>
+      <w:r>
+        <w:rPr>
+          <w:sz w:val="28"/>
+          <w:szCs w:val="28"/>
+        </w:rPr>
+        <w:t>chmod</w:t>
+      </w:r>
+      <w:proofErr w:type="spellEnd"/>
+      <w:r>
+        <w:rPr>
+          <w:sz w:val="28"/>
+          <w:szCs w:val="28"/>
+        </w:rPr>
+        <w:t xml:space="preserve"> 700 </w:t>
+      </w:r>
+      <w:proofErr w:type="spellStart"/>
+      <w:r>
+        <w:rPr>
+          <w:sz w:val="28"/>
+          <w:szCs w:val="28"/>
+        </w:rPr>
+        <w:t>known_hosts</w:t>
+      </w:r>
+      <w:proofErr w:type="spellEnd"/>
+    </w:p>
+    <w:p>
+      <w:pPr>
+        <w:pStyle w:val="ListParagraph"/>
+        <w:numPr>
+          <w:ilvl w:val="0"/>
+          <w:numId w:val="3"/>
+        </w:numPr>
+        <w:spacing w:after="0"/>
+        <w:rPr>
+          <w:sz w:val="28"/>
+          <w:szCs w:val="28"/>
+        </w:rPr>
+      </w:pPr>
+      <w:r>
+        <w:rPr>
+          <w:sz w:val="28"/>
+          <w:szCs w:val="28"/>
+        </w:rPr>
+        <w:t xml:space="preserve"># </w:t>
+      </w:r>
+      <w:proofErr w:type="spellStart"/>
+      <w:proofErr w:type="gramStart"/>
+      <w:r>
+        <w:rPr>
+          <w:sz w:val="28"/>
+          <w:szCs w:val="28"/>
+        </w:rPr>
+        <w:t>DOne</w:t>
+      </w:r>
+      <w:proofErr w:type="spellEnd"/>
+      <w:r>
+        <w:rPr>
+          <w:sz w:val="28"/>
+          <w:szCs w:val="28"/>
+        </w:rPr>
+        <w:t xml:space="preserve"> !!</w:t>
+      </w:r>
+      <w:proofErr w:type="gramEnd"/>
+    </w:p>
+    <w:p>
+      <w:pPr>
+        <w:spacing w:after="0"/>
+        <w:rPr>
+          <w:sz w:val="28"/>
+          <w:szCs w:val="28"/>
+        </w:rPr>
+      </w:pPr>
+      <w:r>
+        <w:rPr>
+          <w:sz w:val="28"/>
+          <w:szCs w:val="28"/>
+        </w:rPr>
+        <w:drawing>
+          <wp:inline distT="0" distB="0" distL="0" distR="0" wp14:anchorId="0771C24A" wp14:editId="0FBF1996">
+            <wp:extent cx="7381240" cy="1902460"/>
+            <wp:effectExtent l="0" t="0" r="0" b="2540"/>
+            <wp:docPr id="1618443939" name="Picture 1"/>
+            <wp:cNvGraphicFramePr>
+              <a:graphicFrameLocks xmlns:a="http://schemas.openxmlformats.org/drawingml/2006/main" noChangeAspect="1"/>
+            </wp:cNvGraphicFramePr>
+            <a:graphic xmlns:a="http://schemas.openxmlformats.org/drawingml/2006/main">
+              <a:graphicData uri="http://schemas.openxmlformats.org/drawingml/2006/picture">
+                <pic:pic xmlns:pic="http://schemas.openxmlformats.org/drawingml/2006/picture">
+                  <pic:nvPicPr>
+                    <pic:cNvPr id="1618443939" name=""/>
+                    <pic:cNvPicPr/>
+                  </pic:nvPicPr>
+                  <pic:blipFill>
+                    <a:blip r:embed="rId10"/>
+                    <a:stretch>
+                      <a:fillRect/>
+                    </a:stretch>
+                  </pic:blipFill>
+                  <pic:spPr>
+                    <a:xfrm>
+                      <a:off x="0" y="0"/>
+                      <a:ext cx="7381240" cy="1902460"/>
+                    </a:xfrm>
+                    <a:prstGeom prst="rect">
+                      <a:avLst/>
+                    </a:prstGeom>
+                  </pic:spPr>
+                </pic:pic>
+              </a:graphicData>
+            </a:graphic>
+          </wp:inline>
+        </w:drawing>
+      </w:r>
+    </w:p>
+    <w:p>
+      <w:pPr>
+        <w:spacing w:after="0"/>
+        <w:rPr>
+          <w:sz w:val="28"/>
+          <w:szCs w:val="28"/>
+        </w:rPr>
+      </w:pPr>
+      <w:r>
+        <w:rPr>
+          <w:sz w:val="28"/>
+          <w:szCs w:val="28"/>
+        </w:rPr>
+        <w:drawing>
+          <wp:inline distT="0" distB="0" distL="0" distR="0" wp14:anchorId="07516123" wp14:editId="31581251">
+            <wp:extent cx="7381240" cy="970280"/>
+            <wp:effectExtent l="0" t="0" r="0" b="1270"/>
+            <wp:docPr id="1231532256" name="Picture 1"/>
+            <wp:cNvGraphicFramePr>
+              <a:graphicFrameLocks xmlns:a="http://schemas.openxmlformats.org/drawingml/2006/main" noChangeAspect="1"/>
+            </wp:cNvGraphicFramePr>
+            <a:graphic xmlns:a="http://schemas.openxmlformats.org/drawingml/2006/main">
+              <a:graphicData uri="http://schemas.openxmlformats.org/drawingml/2006/picture">
+                <pic:pic xmlns:pic="http://schemas.openxmlformats.org/drawingml/2006/picture">
+                  <pic:nvPicPr>
+                    <pic:cNvPr id="1231532256" name=""/>
+                    <pic:cNvPicPr/>
+                  </pic:nvPicPr>
+                  <pic:blipFill>
+                    <a:blip r:embed="rId11"/>
+                    <a:stretch>
+                      <a:fillRect/>
+                    </a:stretch>
+                  </pic:blipFill>
+                  <pic:spPr>
+                    <a:xfrm>
+                      <a:off x="0" y="0"/>
+                      <a:ext cx="7381240" cy="970280"/>
+                    </a:xfrm>
+                    <a:prstGeom prst="rect">
+                      <a:avLst/>
+                    </a:prstGeom>
+                  </pic:spPr>
+                </pic:pic>
+              </a:graphicData>
+            </a:graphic>
+          </wp:inline>
+        </w:drawing>
+      </w:r>
+    </w:p>
+    <w:p>
+      <w:pPr>
+        <w:spacing w:after="0"/>
+        <w:rPr>
+          <w:sz w:val="28"/>
+          <w:szCs w:val="28"/>
+        </w:rPr>
+      </w:pPr>
+      <w:r>
+        <w:rPr>
+          <w:sz w:val="28"/>
+          <w:szCs w:val="28"/>
+        </w:rPr>
+        <w:drawing>
+          <wp:inline distT="0" distB="0" distL="0" distR="0" wp14:anchorId="6298C281" wp14:editId="196AC900">
+            <wp:extent cx="7001852" cy="1086002"/>
+            <wp:effectExtent l="0" t="0" r="0" b="0"/>
+            <wp:docPr id="826249742" name="Picture 1"/>
+            <wp:cNvGraphicFramePr>
+              <a:graphicFrameLocks xmlns:a="http://schemas.openxmlformats.org/drawingml/2006/main" noChangeAspect="1"/>
+            </wp:cNvGraphicFramePr>
+            <a:graphic xmlns:a="http://schemas.openxmlformats.org/drawingml/2006/main">
+              <a:graphicData uri="http://schemas.openxmlformats.org/drawingml/2006/picture">
+                <pic:pic xmlns:pic="http://schemas.openxmlformats.org/drawingml/2006/picture">
+                  <pic:nvPicPr>
+                    <pic:cNvPr id="826249742" name=""/>
+                    <pic:cNvPicPr/>
+                  </pic:nvPicPr>
+                  <pic:blipFill>
+                    <a:blip r:embed="rId12"/>
+                    <a:stretch>
+                      <a:fillRect/>
+                    </a:stretch>
+                  </pic:blipFill>
+                  <pic:spPr>
+                    <a:xfrm>
+                      <a:off x="0" y="0"/>
+                      <a:ext cx="7001852" cy="1086002"/>
+                    </a:xfrm>
+                    <a:prstGeom prst="rect">
+                      <a:avLst/>
+                    </a:prstGeom>
+                  </pic:spPr>
+                </pic:pic>
+              </a:graphicData>
+            </a:graphic>
+          </wp:inline>
+        </w:drawing>
+      </w:r>
+    </w:p>
+    <w:p>
+      <w:pPr>
+        <w:spacing w:after="0"/>
+        <w:rPr>
+          <w:sz w:val="28"/>
+          <w:szCs w:val="28"/>
+        </w:rPr>
+      </w:pPr>
+    </w:p>
+    <w:p>
+      <w:pPr>
+        <w:spacing w:after="0"/>
+        <w:rPr>
+          <w:sz w:val="28"/>
+          <w:szCs w:val="28"/>
+        </w:rPr>
+      </w:pPr>
+    </w:p>
+    <w:p>
+      <w:pPr>
+        <w:spacing w:after="0"/>
+        <w:rPr>
+          <w:sz w:val="28"/>
+          <w:szCs w:val="28"/>
+        </w:rPr>
+      </w:pPr>
+      <w:r>
+        <w:rPr>
+          <w:sz w:val="28"/>
+          <w:szCs w:val="28"/>
+        </w:rPr>
+        <w:lastRenderedPageBreak/>
+        <w:tab/>
+      </w:r>
+    </w:p>
+    <w:p>
+      <w:pPr>
+        <w:spacing w:after="0"/>
+        <w:rPr>
+          <w:b/>
+          <w:bCs/>
+          <w:sz w:val="28"/>
+          <w:szCs w:val="28"/>
+        </w:rPr>
+      </w:pPr>
+      <w:r>
+        <w:rPr>
+          <w:sz w:val="28"/>
+          <w:szCs w:val="28"/>
+        </w:rPr>
+        <w:tab/>
+      </w:r>
+      <w:r>
+        <w:rPr>
+          <w:sz w:val="28"/>
+          <w:szCs w:val="28"/>
+        </w:rPr>
+        <w:tab/>
+      </w:r>
+      <w:r>
+        <w:rPr>
+          <w:b/>
+          <w:bCs/>
+          <w:sz w:val="28"/>
+          <w:szCs w:val="28"/>
+        </w:rPr>
+        <w:t xml:space="preserve">Steps to be done on </w:t>
+      </w:r>
+      <w:proofErr w:type="spellStart"/>
+      <w:r>
+        <w:rPr>
+          <w:b/>
+          <w:bCs/>
+          <w:sz w:val="28"/>
+          <w:szCs w:val="28"/>
+        </w:rPr>
+        <w:t>jenkins</w:t>
+      </w:r>
+      <w:proofErr w:type="spellEnd"/>
+      <w:r>
+        <w:rPr>
+          <w:b/>
+          <w:bCs/>
+          <w:sz w:val="28"/>
+          <w:szCs w:val="28"/>
+        </w:rPr>
+        <w:t xml:space="preserve"> GUI:</w:t>
+      </w:r>
+    </w:p>
+    <w:p>
+      <w:pPr>
+        <w:pStyle w:val="ListParagraph"/>
+        <w:numPr>
+          <w:ilvl w:val="0"/>
+          <w:numId w:val="4"/>
+        </w:numPr>
+        <w:spacing w:after="0"/>
+        <w:rPr>
+          <w:sz w:val="28"/>
+          <w:szCs w:val="28"/>
+        </w:rPr>
+      </w:pPr>
+      <w:r>
+        <w:rPr>
+          <w:sz w:val="28"/>
+          <w:szCs w:val="28"/>
+        </w:rPr>
+        <w:t xml:space="preserve">Go to manage </w:t>
+      </w:r>
+      <w:proofErr w:type="spellStart"/>
+      <w:r>
+        <w:rPr>
+          <w:sz w:val="28"/>
+          <w:szCs w:val="28"/>
+        </w:rPr>
+        <w:t>jenkins</w:t>
+      </w:r>
+      <w:proofErr w:type="spellEnd"/>
+    </w:p>
+    <w:p>
+      <w:pPr>
+        <w:pStyle w:val="ListParagraph"/>
+        <w:numPr>
+          <w:ilvl w:val="0"/>
+          <w:numId w:val="4"/>
+        </w:numPr>
+        <w:spacing w:after="0"/>
+        <w:rPr>
+          <w:sz w:val="28"/>
+          <w:szCs w:val="28"/>
+        </w:rPr>
+      </w:pPr>
+      <w:r>
+        <w:rPr>
+          <w:sz w:val="28"/>
+          <w:szCs w:val="28"/>
+        </w:rPr>
+        <w:t>open manage node</w:t>
+      </w:r>
+    </w:p>
+    <w:p>
+      <w:pPr>
+        <w:pStyle w:val="ListParagraph"/>
+        <w:numPr>
+          <w:ilvl w:val="0"/>
+          <w:numId w:val="4"/>
+        </w:numPr>
+        <w:spacing w:after="0"/>
+        <w:rPr>
+          <w:sz w:val="28"/>
+          <w:szCs w:val="28"/>
+        </w:rPr>
+      </w:pPr>
+      <w:r>
+        <w:rPr>
+          <w:sz w:val="28"/>
+          <w:szCs w:val="28"/>
+        </w:rPr>
+        <w:t xml:space="preserve">under launch method select "Launch via </w:t>
+      </w:r>
+      <w:proofErr w:type="spellStart"/>
+      <w:r>
+        <w:rPr>
+          <w:sz w:val="28"/>
+          <w:szCs w:val="28"/>
+        </w:rPr>
+        <w:t>SSh</w:t>
+      </w:r>
+      <w:proofErr w:type="spellEnd"/>
+      <w:r>
+        <w:rPr>
+          <w:sz w:val="28"/>
+          <w:szCs w:val="28"/>
+        </w:rPr>
+        <w:t>"</w:t>
+      </w:r>
+    </w:p>
+    <w:p>
+      <w:pPr>
+        <w:pStyle w:val="ListParagraph"/>
+        <w:numPr>
+          <w:ilvl w:val="0"/>
+          <w:numId w:val="4"/>
+        </w:numPr>
+        <w:spacing w:after="0"/>
+        <w:rPr>
+          <w:sz w:val="28"/>
+          <w:szCs w:val="28"/>
+        </w:rPr>
+      </w:pPr>
+      <w:r>
+        <w:rPr>
+          <w:sz w:val="28"/>
+          <w:szCs w:val="28"/>
+        </w:rPr>
+        <w:t xml:space="preserve">Host "public </w:t>
+      </w:r>
+      <w:proofErr w:type="spellStart"/>
+      <w:r>
+        <w:rPr>
+          <w:sz w:val="28"/>
+          <w:szCs w:val="28"/>
+        </w:rPr>
+        <w:t>ip</w:t>
+      </w:r>
+      <w:proofErr w:type="spellEnd"/>
+      <w:r>
+        <w:rPr>
+          <w:sz w:val="28"/>
+          <w:szCs w:val="28"/>
+        </w:rPr>
+        <w:t xml:space="preserve"> of slave"</w:t>
+      </w:r>
+    </w:p>
+    <w:p>
+      <w:pPr>
+        <w:pStyle w:val="ListParagraph"/>
+        <w:numPr>
+          <w:ilvl w:val="0"/>
+          <w:numId w:val="4"/>
+        </w:numPr>
+        <w:spacing w:after="0"/>
+        <w:rPr>
+          <w:sz w:val="28"/>
+          <w:szCs w:val="28"/>
+        </w:rPr>
+      </w:pPr>
+      <w:proofErr w:type="spellStart"/>
+      <w:r>
+        <w:rPr>
+          <w:sz w:val="28"/>
+          <w:szCs w:val="28"/>
+        </w:rPr>
+        <w:t>creditals</w:t>
+      </w:r>
+      <w:proofErr w:type="spellEnd"/>
+      <w:r>
+        <w:rPr>
+          <w:sz w:val="28"/>
+          <w:szCs w:val="28"/>
+        </w:rPr>
+        <w:t>: select user with private key</w:t>
+      </w:r>
+    </w:p>
+    <w:p>
+      <w:pPr>
+        <w:pStyle w:val="ListParagraph"/>
+        <w:numPr>
+          <w:ilvl w:val="0"/>
+          <w:numId w:val="4"/>
+        </w:numPr>
+        <w:spacing w:after="0"/>
+        <w:rPr>
+          <w:sz w:val="28"/>
+          <w:szCs w:val="28"/>
+        </w:rPr>
+      </w:pPr>
+      <w:r>
+        <w:rPr>
+          <w:sz w:val="28"/>
+          <w:szCs w:val="28"/>
+        </w:rPr>
+        <w:t xml:space="preserve">enter ec2-user as name and paste the </w:t>
+      </w:r>
+      <w:proofErr w:type="spellStart"/>
+      <w:r>
+        <w:rPr>
+          <w:sz w:val="28"/>
+          <w:szCs w:val="28"/>
+        </w:rPr>
+        <w:t>pem</w:t>
+      </w:r>
+      <w:proofErr w:type="spellEnd"/>
+      <w:r>
+        <w:rPr>
+          <w:sz w:val="28"/>
+          <w:szCs w:val="28"/>
+        </w:rPr>
+        <w:t xml:space="preserve"> key.</w:t>
+      </w:r>
+    </w:p>
+    <w:p>
+      <w:pPr>
+        <w:pStyle w:val="ListParagraph"/>
+        <w:numPr>
+          <w:ilvl w:val="0"/>
+          <w:numId w:val="4"/>
+        </w:numPr>
+        <w:spacing w:after="0"/>
+        <w:rPr>
+          <w:sz w:val="28"/>
+          <w:szCs w:val="28"/>
+        </w:rPr>
+      </w:pPr>
+      <w:r>
+        <w:rPr>
+          <w:sz w:val="28"/>
+          <w:szCs w:val="28"/>
+        </w:rPr>
+        <w:t xml:space="preserve">host key verification </w:t>
+      </w:r>
+      <w:proofErr w:type="spellStart"/>
+      <w:r>
+        <w:rPr>
+          <w:sz w:val="28"/>
+          <w:szCs w:val="28"/>
+        </w:rPr>
+        <w:t>startegy</w:t>
+      </w:r>
+      <w:proofErr w:type="spellEnd"/>
+      <w:r>
+        <w:rPr>
+          <w:sz w:val="28"/>
+          <w:szCs w:val="28"/>
+        </w:rPr>
+        <w:t xml:space="preserve"> to be selected</w:t>
+      </w:r>
+    </w:p>
+    <w:p>
+      <w:pPr>
+        <w:pStyle w:val="ListParagraph"/>
+        <w:numPr>
+          <w:ilvl w:val="0"/>
+          <w:numId w:val="4"/>
+        </w:numPr>
+        <w:spacing w:after="0"/>
+        <w:rPr>
+          <w:sz w:val="28"/>
+          <w:szCs w:val="28"/>
+        </w:rPr>
+      </w:pPr>
+      <w:proofErr w:type="gramStart"/>
+      <w:r>
+        <w:rPr>
+          <w:sz w:val="28"/>
+          <w:szCs w:val="28"/>
+        </w:rPr>
+        <w:t>save..</w:t>
+      </w:r>
+      <w:proofErr w:type="gramEnd"/>
+    </w:p>
+    <w:p>
+      <w:pPr>
+        <w:pStyle w:val="ListParagraph"/>
+        <w:numPr>
+          <w:ilvl w:val="0"/>
+          <w:numId w:val="4"/>
+        </w:numPr>
+        <w:spacing w:after="0"/>
+        <w:rPr>
+          <w:sz w:val="28"/>
+          <w:szCs w:val="28"/>
+        </w:rPr>
+      </w:pPr>
+      <w:r>
+        <w:rPr>
+          <w:sz w:val="28"/>
+          <w:szCs w:val="28"/>
+        </w:rPr>
+        <w:t>we are good with the master and slave configuration</w:t>
+      </w:r>
+    </w:p>
+    <w:p>
+      <w:pPr>
+        <w:spacing w:after="0"/>
+        <w:rPr>
+          <w:sz w:val="28"/>
+          <w:szCs w:val="28"/>
+        </w:rPr>
+      </w:pPr>
+      <w:r>
+        <w:rPr>
+          <w:sz w:val="28"/>
+          <w:szCs w:val="28"/>
+        </w:rPr>
+        <w:drawing>
+          <wp:inline distT="0" distB="0" distL="0" distR="0" wp14:anchorId="57D3C750" wp14:editId="5B8D1F50">
+            <wp:extent cx="7381240" cy="2151380"/>
+            <wp:effectExtent l="0" t="0" r="0" b="1270"/>
+            <wp:docPr id="704337115" name="Picture 1"/>
+            <wp:cNvGraphicFramePr>
+              <a:graphicFrameLocks xmlns:a="http://schemas.openxmlformats.org/drawingml/2006/main" noChangeAspect="1"/>
+            </wp:cNvGraphicFramePr>
+            <a:graphic xmlns:a="http://schemas.openxmlformats.org/drawingml/2006/main">
+              <a:graphicData uri="http://schemas.openxmlformats.org/drawingml/2006/picture">
+                <pic:pic xmlns:pic="http://schemas.openxmlformats.org/drawingml/2006/picture">
+                  <pic:nvPicPr>
+                    <pic:cNvPr id="704337115" name=""/>
+                    <pic:cNvPicPr/>
+                  </pic:nvPicPr>
+                  <pic:blipFill>
+                    <a:blip r:embed="rId13"/>
+                    <a:stretch>
+                      <a:fillRect/>
+                    </a:stretch>
+                  </pic:blipFill>
+                  <pic:spPr>
+                    <a:xfrm>
+                      <a:off x="0" y="0"/>
+                      <a:ext cx="7381240" cy="2151380"/>
+                    </a:xfrm>
+                    <a:prstGeom prst="rect">
+                      <a:avLst/>
+                    </a:prstGeom>
+                  </pic:spPr>
+                </pic:pic>
+              </a:graphicData>
+            </a:graphic>
+          </wp:inline>
+        </w:drawing>
+      </w:r>
+    </w:p>
+    <w:p>
+      <w:pPr>
+        <w:spacing w:after="0"/>
+        <w:rPr>
+          <w:sz w:val="28"/>
+          <w:szCs w:val="28"/>
+        </w:rPr>
+      </w:pPr>
+      <w:r>
+        <w:rPr>
+          <w:sz w:val="28"/>
+          <w:szCs w:val="28"/>
+        </w:rPr>
+        <w:drawing>
+          <wp:inline distT="0" distB="0" distL="0" distR="0" wp14:anchorId="4A49178A" wp14:editId="4A4F83F1">
+            <wp:extent cx="7381240" cy="3086735"/>
+            <wp:effectExtent l="0" t="0" r="0" b="0"/>
+            <wp:docPr id="1319500602" name="Picture 1"/>
+            <wp:cNvGraphicFramePr>
+              <a:graphicFrameLocks xmlns:a="http://schemas.openxmlformats.org/drawingml/2006/main" noChangeAspect="1"/>
+            </wp:cNvGraphicFramePr>
+            <a:graphic xmlns:a="http://schemas.openxmlformats.org/drawingml/2006/main">
+              <a:graphicData uri="http://schemas.openxmlformats.org/drawingml/2006/picture">
+                <pic:pic xmlns:pic="http://schemas.openxmlformats.org/drawingml/2006/picture">
+                  <pic:nvPicPr>
+                    <pic:cNvPr id="1319500602" name=""/>
+                    <pic:cNvPicPr/>
+                  </pic:nvPicPr>
+                  <pic:blipFill>
+                    <a:blip r:embed="rId14"/>
+                    <a:stretch>
+                      <a:fillRect/>
+                    </a:stretch>
+                  </pic:blipFill>
+                  <pic:spPr>
+                    <a:xfrm>
+                      <a:off x="0" y="0"/>
+                      <a:ext cx="7381240" cy="3086735"/>
+                    </a:xfrm>
+                    <a:prstGeom prst="rect">
+                      <a:avLst/>
+                    </a:prstGeom>
+                  </pic:spPr>
+                </pic:pic>
+              </a:graphicData>
+            </a:graphic>
+          </wp:inline>
+        </w:drawing>
+      </w:r>
+    </w:p>
+    <w:p>
+      <w:pPr>
+        <w:spacing w:after="0"/>
+        <w:jc w:val="center"/>
+        <w:rPr>
+          <w:b/>
+          <w:bCs/>
+          <w:sz w:val="28"/>
+          <w:szCs w:val="28"/>
+        </w:rPr>
+      </w:pPr>
+      <w:r>
+        <w:rPr>
+          <w:b/>
+          <w:bCs/>
+          <w:sz w:val="28"/>
+          <w:szCs w:val="28"/>
+        </w:rPr>
+        <w:t>Repeat the same steps to configure to Master</w:t>
+      </w:r>
+    </w:p>
+    <w:p>
+      <w:pPr>
+        <w:spacing w:after="0"/>
+        <w:rPr>
+          <w:b/>
+          <w:bCs/>
+          <w:sz w:val="28"/>
+          <w:szCs w:val="28"/>
+        </w:rPr>
+      </w:pPr>
+      <w:r>
+        <w:rPr>
+          <w:b/>
+          <w:bCs/>
+          <w:sz w:val="28"/>
+          <w:szCs w:val="28"/>
+        </w:rPr>
+        <w:drawing>
+          <wp:inline distT="0" distB="0" distL="0" distR="0" wp14:anchorId="5DDF8264" wp14:editId="5B05B81A">
+            <wp:extent cx="7381240" cy="1600200"/>
+            <wp:effectExtent l="0" t="0" r="0" b="0"/>
+            <wp:docPr id="1826786885" name="Picture 1"/>
+            <wp:cNvGraphicFramePr>
+              <a:graphicFrameLocks xmlns:a="http://schemas.openxmlformats.org/drawingml/2006/main" noChangeAspect="1"/>
+            </wp:cNvGraphicFramePr>
+            <a:graphic xmlns:a="http://schemas.openxmlformats.org/drawingml/2006/main">
+              <a:graphicData uri="http://schemas.openxmlformats.org/drawingml/2006/picture">
+                <pic:pic xmlns:pic="http://schemas.openxmlformats.org/drawingml/2006/picture">
+                  <pic:nvPicPr>
+                    <pic:cNvPr id="1826786885" name=""/>
+                    <pic:cNvPicPr/>
+                  </pic:nvPicPr>
+                  <pic:blipFill>
+                    <a:blip r:embed="rId15"/>
+                    <a:stretch>
+                      <a:fillRect/>
+                    </a:stretch>
+                  </pic:blipFill>
+                  <pic:spPr>
+                    <a:xfrm>
+                      <a:off x="0" y="0"/>
+                      <a:ext cx="7381240" cy="1600200"/>
+                    </a:xfrm>
+                    <a:prstGeom prst="rect">
+                      <a:avLst/>
+                    </a:prstGeom>
+                  </pic:spPr>
+                </pic:pic>
+              </a:graphicData>
+            </a:graphic>
+          </wp:inline>
+        </w:drawing>
+      </w:r>
+    </w:p>
+    <w:p>
+      <w:pPr>
+        <w:spacing w:after="0"/>
+        <w:rPr>
+          <w:b/>
+          <w:bCs/>
+          <w:sz w:val="28"/>
+          <w:szCs w:val="28"/>
+        </w:rPr>
+      </w:pPr>
+    </w:p>
+    <w:p>
+      <w:pPr>
+        <w:spacing w:after="0"/>
+        <w:rPr>
+          <w:b/>
+          <w:bCs/>
+          <w:sz w:val="28"/>
+          <w:szCs w:val="28"/>
+        </w:rPr>
+      </w:pPr>
+    </w:p>
+    <w:p>
+      <w:pPr>
+        <w:spacing w:after="0"/>
+        <w:rPr>
+          <w:b/>
+          <w:bCs/>
+          <w:sz w:val="28"/>
+          <w:szCs w:val="28"/>
+        </w:rPr>
+      </w:pPr>
+    </w:p>
+    <w:p>
+      <w:pPr>
+        <w:spacing w:after="0"/>
+        <w:rPr>
+          <w:b/>
+          <w:bCs/>
+          <w:sz w:val="28"/>
+          <w:szCs w:val="28"/>
+        </w:rPr>
+      </w:pPr>
     </w:p>
     <w:sectPr>
       <w:pgSz w:w="11906" w:h="16838"/>
@@ -55,6 +1755,119 @@
 <file path=word/numbering.xml><?xml version="1.0" encoding="utf-8"?>
 <w:numbering xmlns:wpc="http://schemas.microsoft.com/office/word/2010/wordprocessingCanvas" xmlns:cx="http://schemas.microsoft.com/office/drawing/2014/chartex" xmlns:cx1="http://schemas.microsoft.com/office/drawing/2015/9/8/chartex" xmlns:cx2="http://schemas.microsoft.com/office/drawing/2015/10/21/chartex" xmlns:cx3="http://schemas.microsoft.com/office/drawing/2016/5/9/chartex" xmlns:cx4="http://schemas.microsoft.com/office/drawing/2016/5/10/chartex" xmlns:cx5="http://schemas.microsoft.com/office/drawing/2016/5/11/chartex" xmlns:cx6="http://schemas.microsoft.com/office/drawing/2016/5/12/chartex" xmlns:cx7="http://schemas.microsoft.com/office/drawing/2016/5/13/chartex" xmlns:cx8="http://schemas.microsoft.com/office/drawing/2016/5/14/chartex" xmlns:mc="http://schemas.openxmlformats.org/markup-compatibility/2006" xmlns:aink="http://schemas.microsoft.com/office/drawing/2016/ink" xmlns:am3d="http://schemas.microsoft.com/office/drawing/2017/model3d" xmlns:o="urn:schemas-microsoft-com:office:office" xmlns:oel="http://schemas.microsoft.com/office/2019/extlst" xmlns:r="http://schemas.openxmlformats.org/officeDocument/2006/relationships" xmlns:m="http://schemas.openxmlformats.org/officeDocument/2006/math" xmlns:v="urn:schemas-microsoft-com:vml" xmlns:wp14="http://schemas.microsoft.com/office/word/2010/wordprocessingDrawing" xmlns:wp="http://schemas.openxmlformats.org/drawingml/2006/wordprocessingDrawing" xmlns:w10="urn:schemas-microsoft-com:office:word" xmlns:w="http://schemas.openxmlformats.org/wordprocessingml/2006/main" xmlns:w14="http://schemas.microsoft.com/office/word/2010/wordml" xmlns:w15="http://schemas.microsoft.com/office/word/2012/wordml" xmlns:w16cex="http://schemas.microsoft.com/office/word/2018/wordml/cex" xmlns:w16cid="http://schemas.microsoft.com/office/word/2016/wordml/cid" xmlns:w16="http://schemas.microsoft.com/office/word/2018/wordml" xmlns:w16du="http://schemas.microsoft.com/office/word/2023/wordml/word16du" xmlns:w16sdtdh="http://schemas.microsoft.com/office/word/2020/wordml/sdtdatahash" xmlns:w16sdtfl="http://schemas.microsoft.com/office/word/2024/wordml/sdtformatlock" xmlns:w16se="http://schemas.microsoft.com/office/word/2015/wordml/symex" xmlns:wpg="http://schemas.microsoft.com/office/word/2010/wordprocessingGroup" xmlns:wpi="http://schemas.microsoft.com/office/word/2010/wordprocessingInk" xmlns:wne="http://schemas.microsoft.com/office/word/2006/wordml" xmlns:wps="http://schemas.microsoft.com/office/word/2010/wordprocessingShape" mc:Ignorable="w14 w15 w16se w16cid w16 w16cex w16sdtdh w16sdtfl w16du wp14">
   <w:abstractNum w:abstractNumId="0" w15:restartNumberingAfterBreak="0">
+    <w:nsid w:val="035B783A"/>
+    <w:multiLevelType w:val="hybridMultilevel"/>
+    <w:tmpl w:val="38B04524"/>
+    <w:lvl w:ilvl="0" w:tplc="40090001">
+      <w:start w:val="1"/>
+      <w:numFmt w:val="bullet"/>
+      <w:lvlText w:val=""/>
+      <w:lvlJc w:val="left"/>
+      <w:pPr>
+        <w:ind w:left="2160" w:hanging="360"/>
+      </w:pPr>
+      <w:rPr>
+        <w:rFonts w:ascii="Symbol" w:hAnsi="Symbol" w:hint="default"/>
+      </w:rPr>
+    </w:lvl>
+    <w:lvl w:ilvl="1" w:tplc="40090003" w:tentative="1">
+      <w:start w:val="1"/>
+      <w:numFmt w:val="bullet"/>
+      <w:lvlText w:val="o"/>
+      <w:lvlJc w:val="left"/>
+      <w:pPr>
+        <w:ind w:left="2880" w:hanging="360"/>
+      </w:pPr>
+      <w:rPr>
+        <w:rFonts w:ascii="Courier New" w:hAnsi="Courier New" w:cs="Courier New" w:hint="default"/>
+      </w:rPr>
+    </w:lvl>
+    <w:lvl w:ilvl="2" w:tplc="40090005" w:tentative="1">
+      <w:start w:val="1"/>
+      <w:numFmt w:val="bullet"/>
+      <w:lvlText w:val=""/>
+      <w:lvlJc w:val="left"/>
+      <w:pPr>
+        <w:ind w:left="3600" w:hanging="360"/>
+      </w:pPr>
+      <w:rPr>
+        <w:rFonts w:ascii="Wingdings" w:hAnsi="Wingdings" w:hint="default"/>
+      </w:rPr>
+    </w:lvl>
+    <w:lvl w:ilvl="3" w:tplc="40090001" w:tentative="1">
+      <w:start w:val="1"/>
+      <w:numFmt w:val="bullet"/>
+      <w:lvlText w:val=""/>
+      <w:lvlJc w:val="left"/>
+      <w:pPr>
+        <w:ind w:left="4320" w:hanging="360"/>
+      </w:pPr>
+      <w:rPr>
+        <w:rFonts w:ascii="Symbol" w:hAnsi="Symbol" w:hint="default"/>
+      </w:rPr>
+    </w:lvl>
+    <w:lvl w:ilvl="4" w:tplc="40090003" w:tentative="1">
+      <w:start w:val="1"/>
+      <w:numFmt w:val="bullet"/>
+      <w:lvlText w:val="o"/>
+      <w:lvlJc w:val="left"/>
+      <w:pPr>
+        <w:ind w:left="5040" w:hanging="360"/>
+      </w:pPr>
+      <w:rPr>
+        <w:rFonts w:ascii="Courier New" w:hAnsi="Courier New" w:cs="Courier New" w:hint="default"/>
+      </w:rPr>
+    </w:lvl>
+    <w:lvl w:ilvl="5" w:tplc="40090005" w:tentative="1">
+      <w:start w:val="1"/>
+      <w:numFmt w:val="bullet"/>
+      <w:lvlText w:val=""/>
+      <w:lvlJc w:val="left"/>
+      <w:pPr>
+        <w:ind w:left="5760" w:hanging="360"/>
+      </w:pPr>
+      <w:rPr>
+        <w:rFonts w:ascii="Wingdings" w:hAnsi="Wingdings" w:hint="default"/>
+      </w:rPr>
+    </w:lvl>
+    <w:lvl w:ilvl="6" w:tplc="40090001" w:tentative="1">
+      <w:start w:val="1"/>
+      <w:numFmt w:val="bullet"/>
+      <w:lvlText w:val=""/>
+      <w:lvlJc w:val="left"/>
+      <w:pPr>
+        <w:ind w:left="6480" w:hanging="360"/>
+      </w:pPr>
+      <w:rPr>
+        <w:rFonts w:ascii="Symbol" w:hAnsi="Symbol" w:hint="default"/>
+      </w:rPr>
+    </w:lvl>
+    <w:lvl w:ilvl="7" w:tplc="40090003" w:tentative="1">
+      <w:start w:val="1"/>
+      <w:numFmt w:val="bullet"/>
+      <w:lvlText w:val="o"/>
+      <w:lvlJc w:val="left"/>
+      <w:pPr>
+        <w:ind w:left="7200" w:hanging="360"/>
+      </w:pPr>
+      <w:rPr>
+        <w:rFonts w:ascii="Courier New" w:hAnsi="Courier New" w:cs="Courier New" w:hint="default"/>
+      </w:rPr>
+    </w:lvl>
+    <w:lvl w:ilvl="8" w:tplc="40090005" w:tentative="1">
+      <w:start w:val="1"/>
+      <w:numFmt w:val="bullet"/>
+      <w:lvlText w:val=""/>
+      <w:lvlJc w:val="left"/>
+      <w:pPr>
+        <w:ind w:left="7920" w:hanging="360"/>
+      </w:pPr>
+      <w:rPr>
+        <w:rFonts w:ascii="Wingdings" w:hAnsi="Wingdings" w:hint="default"/>
+      </w:rPr>
+    </w:lvl>
+  </w:abstractNum>
+  <w:abstractNum w:abstractNumId="1" w15:restartNumberingAfterBreak="0">
     <w:nsid w:val="3BFE439C"/>
     <w:multiLevelType w:val="hybridMultilevel"/>
     <w:tmpl w:val="5476B8DA"/>
@@ -143,7 +1956,242 @@
       </w:pPr>
     </w:lvl>
   </w:abstractNum>
+  <w:abstractNum w:abstractNumId="2" w15:restartNumberingAfterBreak="0">
+    <w:nsid w:val="59D638B9"/>
+    <w:multiLevelType w:val="hybridMultilevel"/>
+    <w:tmpl w:val="8730B508"/>
+    <w:lvl w:ilvl="0" w:tplc="40090001">
+      <w:start w:val="1"/>
+      <w:numFmt w:val="bullet"/>
+      <w:lvlText w:val=""/>
+      <w:lvlJc w:val="left"/>
+      <w:pPr>
+        <w:ind w:left="1440" w:hanging="360"/>
+      </w:pPr>
+      <w:rPr>
+        <w:rFonts w:ascii="Symbol" w:hAnsi="Symbol" w:hint="default"/>
+      </w:rPr>
+    </w:lvl>
+    <w:lvl w:ilvl="1" w:tplc="40090003" w:tentative="1">
+      <w:start w:val="1"/>
+      <w:numFmt w:val="bullet"/>
+      <w:lvlText w:val="o"/>
+      <w:lvlJc w:val="left"/>
+      <w:pPr>
+        <w:ind w:left="2160" w:hanging="360"/>
+      </w:pPr>
+      <w:rPr>
+        <w:rFonts w:ascii="Courier New" w:hAnsi="Courier New" w:cs="Courier New" w:hint="default"/>
+      </w:rPr>
+    </w:lvl>
+    <w:lvl w:ilvl="2" w:tplc="40090005" w:tentative="1">
+      <w:start w:val="1"/>
+      <w:numFmt w:val="bullet"/>
+      <w:lvlText w:val=""/>
+      <w:lvlJc w:val="left"/>
+      <w:pPr>
+        <w:ind w:left="2880" w:hanging="360"/>
+      </w:pPr>
+      <w:rPr>
+        <w:rFonts w:ascii="Wingdings" w:hAnsi="Wingdings" w:hint="default"/>
+      </w:rPr>
+    </w:lvl>
+    <w:lvl w:ilvl="3" w:tplc="40090001" w:tentative="1">
+      <w:start w:val="1"/>
+      <w:numFmt w:val="bullet"/>
+      <w:lvlText w:val=""/>
+      <w:lvlJc w:val="left"/>
+      <w:pPr>
+        <w:ind w:left="3600" w:hanging="360"/>
+      </w:pPr>
+      <w:rPr>
+        <w:rFonts w:ascii="Symbol" w:hAnsi="Symbol" w:hint="default"/>
+      </w:rPr>
+    </w:lvl>
+    <w:lvl w:ilvl="4" w:tplc="40090003" w:tentative="1">
+      <w:start w:val="1"/>
+      <w:numFmt w:val="bullet"/>
+      <w:lvlText w:val="o"/>
+      <w:lvlJc w:val="left"/>
+      <w:pPr>
+        <w:ind w:left="4320" w:hanging="360"/>
+      </w:pPr>
+      <w:rPr>
+        <w:rFonts w:ascii="Courier New" w:hAnsi="Courier New" w:cs="Courier New" w:hint="default"/>
+      </w:rPr>
+    </w:lvl>
+    <w:lvl w:ilvl="5" w:tplc="40090005" w:tentative="1">
+      <w:start w:val="1"/>
+      <w:numFmt w:val="bullet"/>
+      <w:lvlText w:val=""/>
+      <w:lvlJc w:val="left"/>
+      <w:pPr>
+        <w:ind w:left="5040" w:hanging="360"/>
+      </w:pPr>
+      <w:rPr>
+        <w:rFonts w:ascii="Wingdings" w:hAnsi="Wingdings" w:hint="default"/>
+      </w:rPr>
+    </w:lvl>
+    <w:lvl w:ilvl="6" w:tplc="40090001" w:tentative="1">
+      <w:start w:val="1"/>
+      <w:numFmt w:val="bullet"/>
+      <w:lvlText w:val=""/>
+      <w:lvlJc w:val="left"/>
+      <w:pPr>
+        <w:ind w:left="5760" w:hanging="360"/>
+      </w:pPr>
+      <w:rPr>
+        <w:rFonts w:ascii="Symbol" w:hAnsi="Symbol" w:hint="default"/>
+      </w:rPr>
+    </w:lvl>
+    <w:lvl w:ilvl="7" w:tplc="40090003" w:tentative="1">
+      <w:start w:val="1"/>
+      <w:numFmt w:val="bullet"/>
+      <w:lvlText w:val="o"/>
+      <w:lvlJc w:val="left"/>
+      <w:pPr>
+        <w:ind w:left="6480" w:hanging="360"/>
+      </w:pPr>
+      <w:rPr>
+        <w:rFonts w:ascii="Courier New" w:hAnsi="Courier New" w:cs="Courier New" w:hint="default"/>
+      </w:rPr>
+    </w:lvl>
+    <w:lvl w:ilvl="8" w:tplc="40090005" w:tentative="1">
+      <w:start w:val="1"/>
+      <w:numFmt w:val="bullet"/>
+      <w:lvlText w:val=""/>
+      <w:lvlJc w:val="left"/>
+      <w:pPr>
+        <w:ind w:left="7200" w:hanging="360"/>
+      </w:pPr>
+      <w:rPr>
+        <w:rFonts w:ascii="Wingdings" w:hAnsi="Wingdings" w:hint="default"/>
+      </w:rPr>
+    </w:lvl>
+  </w:abstractNum>
+  <w:abstractNum w:abstractNumId="3" w15:restartNumberingAfterBreak="0">
+    <w:nsid w:val="5AE54626"/>
+    <w:multiLevelType w:val="hybridMultilevel"/>
+    <w:tmpl w:val="D46A79C2"/>
+    <w:lvl w:ilvl="0" w:tplc="40090001">
+      <w:start w:val="1"/>
+      <w:numFmt w:val="bullet"/>
+      <w:lvlText w:val=""/>
+      <w:lvlJc w:val="left"/>
+      <w:pPr>
+        <w:ind w:left="2160" w:hanging="360"/>
+      </w:pPr>
+      <w:rPr>
+        <w:rFonts w:ascii="Symbol" w:hAnsi="Symbol" w:hint="default"/>
+      </w:rPr>
+    </w:lvl>
+    <w:lvl w:ilvl="1" w:tplc="40090003" w:tentative="1">
+      <w:start w:val="1"/>
+      <w:numFmt w:val="bullet"/>
+      <w:lvlText w:val="o"/>
+      <w:lvlJc w:val="left"/>
+      <w:pPr>
+        <w:ind w:left="2880" w:hanging="360"/>
+      </w:pPr>
+      <w:rPr>
+        <w:rFonts w:ascii="Courier New" w:hAnsi="Courier New" w:cs="Courier New" w:hint="default"/>
+      </w:rPr>
+    </w:lvl>
+    <w:lvl w:ilvl="2" w:tplc="40090005" w:tentative="1">
+      <w:start w:val="1"/>
+      <w:numFmt w:val="bullet"/>
+      <w:lvlText w:val=""/>
+      <w:lvlJc w:val="left"/>
+      <w:pPr>
+        <w:ind w:left="3600" w:hanging="360"/>
+      </w:pPr>
+      <w:rPr>
+        <w:rFonts w:ascii="Wingdings" w:hAnsi="Wingdings" w:hint="default"/>
+      </w:rPr>
+    </w:lvl>
+    <w:lvl w:ilvl="3" w:tplc="40090001" w:tentative="1">
+      <w:start w:val="1"/>
+      <w:numFmt w:val="bullet"/>
+      <w:lvlText w:val=""/>
+      <w:lvlJc w:val="left"/>
+      <w:pPr>
+        <w:ind w:left="4320" w:hanging="360"/>
+      </w:pPr>
+      <w:rPr>
+        <w:rFonts w:ascii="Symbol" w:hAnsi="Symbol" w:hint="default"/>
+      </w:rPr>
+    </w:lvl>
+    <w:lvl w:ilvl="4" w:tplc="40090003" w:tentative="1">
+      <w:start w:val="1"/>
+      <w:numFmt w:val="bullet"/>
+      <w:lvlText w:val="o"/>
+      <w:lvlJc w:val="left"/>
+      <w:pPr>
+        <w:ind w:left="5040" w:hanging="360"/>
+      </w:pPr>
+      <w:rPr>
+        <w:rFonts w:ascii="Courier New" w:hAnsi="Courier New" w:cs="Courier New" w:hint="default"/>
+      </w:rPr>
+    </w:lvl>
+    <w:lvl w:ilvl="5" w:tplc="40090005" w:tentative="1">
+      <w:start w:val="1"/>
+      <w:numFmt w:val="bullet"/>
+      <w:lvlText w:val=""/>
+      <w:lvlJc w:val="left"/>
+      <w:pPr>
+        <w:ind w:left="5760" w:hanging="360"/>
+      </w:pPr>
+      <w:rPr>
+        <w:rFonts w:ascii="Wingdings" w:hAnsi="Wingdings" w:hint="default"/>
+      </w:rPr>
+    </w:lvl>
+    <w:lvl w:ilvl="6" w:tplc="40090001" w:tentative="1">
+      <w:start w:val="1"/>
+      <w:numFmt w:val="bullet"/>
+      <w:lvlText w:val=""/>
+      <w:lvlJc w:val="left"/>
+      <w:pPr>
+        <w:ind w:left="6480" w:hanging="360"/>
+      </w:pPr>
+      <w:rPr>
+        <w:rFonts w:ascii="Symbol" w:hAnsi="Symbol" w:hint="default"/>
+      </w:rPr>
+    </w:lvl>
+    <w:lvl w:ilvl="7" w:tplc="40090003" w:tentative="1">
+      <w:start w:val="1"/>
+      <w:numFmt w:val="bullet"/>
+      <w:lvlText w:val="o"/>
+      <w:lvlJc w:val="left"/>
+      <w:pPr>
+        <w:ind w:left="7200" w:hanging="360"/>
+      </w:pPr>
+      <w:rPr>
+        <w:rFonts w:ascii="Courier New" w:hAnsi="Courier New" w:cs="Courier New" w:hint="default"/>
+      </w:rPr>
+    </w:lvl>
+    <w:lvl w:ilvl="8" w:tplc="40090005" w:tentative="1">
+      <w:start w:val="1"/>
+      <w:numFmt w:val="bullet"/>
+      <w:lvlText w:val=""/>
+      <w:lvlJc w:val="left"/>
+      <w:pPr>
+        <w:ind w:left="7920" w:hanging="360"/>
+      </w:pPr>
+      <w:rPr>
+        <w:rFonts w:ascii="Wingdings" w:hAnsi="Wingdings" w:hint="default"/>
+      </w:rPr>
+    </w:lvl>
+  </w:abstractNum>
   <w:num w:numId="1" w16cid:durableId="259025490">
+    <w:abstractNumId w:val="1"/>
+  </w:num>
+  <w:num w:numId="2" w16cid:durableId="724571783">
+    <w:abstractNumId w:val="3"/>
+  </w:num>
+  <w:num w:numId="3" w16cid:durableId="632909086">
+    <w:abstractNumId w:val="2"/>
+  </w:num>
+  <w:num w:numId="4" w16cid:durableId="1739133629">
     <w:abstractNumId w:val="0"/>
   </w:num>
 </w:numbering>

</xml_diff>

<commit_message>
Added Jenkins Task 2 & 3 files
</commit_message>
<xml_diff>
--- a/Jenkins Task - 2.docx
+++ b/Jenkins Task - 2.docx
@@ -61,6 +61,7 @@
       </w:pPr>
       <w:r>
         <w:rPr>
+          <w:noProof/>
           <w:sz w:val="28"/>
           <w:szCs w:val="28"/>
         </w:rPr>
@@ -120,6 +121,7 @@
       </w:r>
       <w:r>
         <w:rPr>
+          <w:noProof/>
           <w:sz w:val="28"/>
           <w:szCs w:val="28"/>
         </w:rPr>
@@ -172,6 +174,7 @@
       </w:pPr>
       <w:r>
         <w:rPr>
+          <w:noProof/>
           <w:sz w:val="28"/>
           <w:szCs w:val="28"/>
         </w:rPr>
@@ -417,6 +420,7 @@
       </w:pPr>
       <w:r>
         <w:rPr>
+          <w:noProof/>
           <w:sz w:val="28"/>
           <w:szCs w:val="28"/>
         </w:rPr>
@@ -476,6 +480,7 @@
       </w:pPr>
       <w:r>
         <w:rPr>
+          <w:noProof/>
           <w:sz w:val="28"/>
           <w:szCs w:val="28"/>
         </w:rPr>
@@ -1021,6 +1026,7 @@
       </w:pPr>
       <w:r>
         <w:rPr>
+          <w:noProof/>
           <w:sz w:val="28"/>
           <w:szCs w:val="28"/>
         </w:rPr>
@@ -1071,6 +1077,7 @@
       </w:pPr>
       <w:r>
         <w:rPr>
+          <w:noProof/>
           <w:sz w:val="28"/>
           <w:szCs w:val="28"/>
         </w:rPr>
@@ -1121,12 +1128,13 @@
       </w:pPr>
       <w:r>
         <w:rPr>
+          <w:noProof/>
           <w:sz w:val="28"/>
           <w:szCs w:val="28"/>
         </w:rPr>
         <w:drawing>
-          <wp:inline distT="0" distB="0" distL="0" distR="0" wp14:anchorId="6298C281" wp14:editId="196AC900">
-            <wp:extent cx="7001852" cy="1086002"/>
+          <wp:inline distT="0" distB="0" distL="0" distR="0" wp14:anchorId="6298C281" wp14:editId="0BE0DCDF">
+            <wp:extent cx="7381240" cy="1085850"/>
             <wp:effectExtent l="0" t="0" r="0" b="0"/>
             <wp:docPr id="826249742" name="Picture 1"/>
             <wp:cNvGraphicFramePr>
@@ -1148,7 +1156,7 @@
                   <pic:spPr>
                     <a:xfrm>
                       <a:off x="0" y="0"/>
-                      <a:ext cx="7001852" cy="1086002"/>
+                      <a:ext cx="7387215" cy="1086729"/>
                     </a:xfrm>
                     <a:prstGeom prst="rect">
                       <a:avLst/>
@@ -1533,6 +1541,7 @@
       </w:pPr>
       <w:r>
         <w:rPr>
+          <w:noProof/>
           <w:sz w:val="28"/>
           <w:szCs w:val="28"/>
         </w:rPr>
@@ -1583,6 +1592,7 @@
       </w:pPr>
       <w:r>
         <w:rPr>
+          <w:noProof/>
           <w:sz w:val="28"/>
           <w:szCs w:val="28"/>
         </w:rPr>
@@ -1662,10 +1672,10 @@
           <w:szCs w:val="28"/>
         </w:rPr>
         <w:drawing>
-          <wp:inline distT="0" distB="0" distL="0" distR="0" wp14:anchorId="5DDF8264" wp14:editId="5B05B81A">
-            <wp:extent cx="7381240" cy="1600200"/>
+          <wp:inline distT="0" distB="0" distL="0" distR="0" wp14:anchorId="2DFEC035" wp14:editId="7D9D64A3">
+            <wp:extent cx="7381240" cy="1683385"/>
             <wp:effectExtent l="0" t="0" r="0" b="0"/>
-            <wp:docPr id="1826786885" name="Picture 1"/>
+            <wp:docPr id="1194826089" name="Picture 1"/>
             <wp:cNvGraphicFramePr>
               <a:graphicFrameLocks xmlns:a="http://schemas.openxmlformats.org/drawingml/2006/main" noChangeAspect="1"/>
             </wp:cNvGraphicFramePr>
@@ -1673,7 +1683,7 @@
               <a:graphicData uri="http://schemas.openxmlformats.org/drawingml/2006/picture">
                 <pic:pic xmlns:pic="http://schemas.openxmlformats.org/drawingml/2006/picture">
                   <pic:nvPicPr>
-                    <pic:cNvPr id="1826786885" name=""/>
+                    <pic:cNvPr id="1194826089" name=""/>
                     <pic:cNvPicPr/>
                   </pic:nvPicPr>
                   <pic:blipFill>
@@ -1685,7 +1695,7 @@
                   <pic:spPr>
                     <a:xfrm>
                       <a:off x="0" y="0"/>
-                      <a:ext cx="7381240" cy="1600200"/>
+                      <a:ext cx="7381240" cy="1683385"/>
                     </a:xfrm>
                     <a:prstGeom prst="rect">
                       <a:avLst/>
@@ -1722,21 +1732,2562 @@
     </w:p>
     <w:p>
       <w:pPr>
-        <w:spacing w:after="0"/>
+        <w:pStyle w:val="ListParagraph"/>
+        <w:spacing w:after="0"/>
+        <w:ind w:left="426"/>
+        <w:rPr>
+          <w:sz w:val="36"/>
+          <w:szCs w:val="36"/>
+        </w:rPr>
+      </w:pPr>
+    </w:p>
+    <w:p>
+      <w:pPr>
+        <w:pStyle w:val="ListParagraph"/>
+        <w:numPr>
+          <w:ilvl w:val="0"/>
+          <w:numId w:val="1"/>
+        </w:numPr>
+        <w:spacing w:after="0"/>
+        <w:ind w:left="426" w:hanging="294"/>
+        <w:rPr>
+          <w:sz w:val="36"/>
+          <w:szCs w:val="36"/>
+        </w:rPr>
+      </w:pPr>
+      <w:r>
+        <w:rPr>
+          <w:sz w:val="36"/>
+          <w:szCs w:val="36"/>
+        </w:rPr>
+        <w:t>Configure webhooks to Jenkins job.</w:t>
+      </w:r>
+    </w:p>
+    <w:p>
+      <w:pPr>
+        <w:pStyle w:val="ListParagraph"/>
+        <w:spacing w:after="0"/>
+        <w:ind w:left="426"/>
+        <w:rPr>
+          <w:sz w:val="28"/>
+          <w:szCs w:val="28"/>
+        </w:rPr>
+      </w:pPr>
+      <w:r>
+        <w:rPr>
+          <w:sz w:val="28"/>
+          <w:szCs w:val="28"/>
+        </w:rPr>
+        <w:t xml:space="preserve">Step 1: </w:t>
+      </w:r>
+      <w:r>
+        <w:rPr>
+          <w:sz w:val="28"/>
+          <w:szCs w:val="28"/>
+        </w:rPr>
+        <w:t>Goto GitHub Repository</w:t>
+      </w:r>
+      <w:r>
+        <w:rPr>
+          <w:sz w:val="28"/>
+          <w:szCs w:val="28"/>
+        </w:rPr>
+        <w:sym w:font="Wingdings" w:char="F0E0"/>
+      </w:r>
+      <w:r>
+        <w:rPr>
+          <w:sz w:val="28"/>
+          <w:szCs w:val="28"/>
+        </w:rPr>
+        <w:t>settings</w:t>
+      </w:r>
+      <w:r>
+        <w:rPr>
+          <w:sz w:val="28"/>
+          <w:szCs w:val="28"/>
+        </w:rPr>
+        <w:sym w:font="Wingdings" w:char="F0E0"/>
+      </w:r>
+      <w:r>
+        <w:rPr>
+          <w:sz w:val="28"/>
+          <w:szCs w:val="28"/>
+        </w:rPr>
+        <w:t>webhooks</w:t>
+      </w:r>
+      <w:r>
+        <w:rPr>
+          <w:sz w:val="28"/>
+          <w:szCs w:val="28"/>
+        </w:rPr>
+        <w:sym w:font="Wingdings" w:char="F0E0"/>
+      </w:r>
+      <w:r>
+        <w:rPr>
+          <w:sz w:val="28"/>
+          <w:szCs w:val="28"/>
+        </w:rPr>
+        <w:t>Add webhook</w:t>
+      </w:r>
+      <w:r>
+        <w:rPr>
+          <w:sz w:val="28"/>
+          <w:szCs w:val="28"/>
+        </w:rPr>
+        <w:sym w:font="Wingdings" w:char="F0E0"/>
+      </w:r>
+      <w:r>
+        <w:rPr>
+          <w:sz w:val="28"/>
+          <w:szCs w:val="28"/>
+        </w:rPr>
+        <w:t xml:space="preserve"> Paste Jenkins URL with prefix </w:t>
+      </w:r>
+      <w:r>
         <w:rPr>
           <w:b/>
           <w:bCs/>
           <w:sz w:val="28"/>
           <w:szCs w:val="28"/>
         </w:rPr>
-      </w:pPr>
-    </w:p>
-    <w:p>
-      <w:pPr>
-        <w:spacing w:after="0"/>
+        <w:t>/</w:t>
+      </w:r>
+      <w:proofErr w:type="spellStart"/>
+      <w:r>
         <w:rPr>
           <w:b/>
           <w:bCs/>
+          <w:sz w:val="28"/>
+          <w:szCs w:val="28"/>
+        </w:rPr>
+        <w:t>github</w:t>
+      </w:r>
+      <w:proofErr w:type="spellEnd"/>
+      <w:r>
+        <w:rPr>
+          <w:b/>
+          <w:bCs/>
+          <w:sz w:val="28"/>
+          <w:szCs w:val="28"/>
+        </w:rPr>
+        <w:t>-webhook/</w:t>
+      </w:r>
+      <w:r>
+        <w:rPr>
+          <w:sz w:val="28"/>
+          <w:szCs w:val="28"/>
+        </w:rPr>
+        <w:sym w:font="Wingdings" w:char="F0E0"/>
+      </w:r>
+      <w:r>
+        <w:rPr>
+          <w:sz w:val="28"/>
+          <w:szCs w:val="28"/>
+        </w:rPr>
+        <w:t>select Add webhook.</w:t>
+      </w:r>
+    </w:p>
+    <w:p>
+      <w:pPr>
+        <w:pStyle w:val="ListParagraph"/>
+        <w:spacing w:after="0"/>
+        <w:ind w:left="0"/>
+        <w:rPr>
+          <w:b/>
+          <w:bCs/>
+          <w:sz w:val="28"/>
+          <w:szCs w:val="28"/>
+        </w:rPr>
+      </w:pPr>
+      <w:r>
+        <w:rPr>
+          <w:b/>
+          <w:bCs/>
+          <w:sz w:val="28"/>
+          <w:szCs w:val="28"/>
+        </w:rPr>
+        <w:drawing>
+          <wp:inline distT="0" distB="0" distL="0" distR="0" wp14:anchorId="23E777F1" wp14:editId="4348F946">
+            <wp:extent cx="7381240" cy="3522980"/>
+            <wp:effectExtent l="0" t="0" r="0" b="1270"/>
+            <wp:docPr id="335751589" name="Picture 1"/>
+            <wp:cNvGraphicFramePr>
+              <a:graphicFrameLocks xmlns:a="http://schemas.openxmlformats.org/drawingml/2006/main" noChangeAspect="1"/>
+            </wp:cNvGraphicFramePr>
+            <a:graphic xmlns:a="http://schemas.openxmlformats.org/drawingml/2006/main">
+              <a:graphicData uri="http://schemas.openxmlformats.org/drawingml/2006/picture">
+                <pic:pic xmlns:pic="http://schemas.openxmlformats.org/drawingml/2006/picture">
+                  <pic:nvPicPr>
+                    <pic:cNvPr id="335751589" name=""/>
+                    <pic:cNvPicPr/>
+                  </pic:nvPicPr>
+                  <pic:blipFill>
+                    <a:blip r:embed="rId16"/>
+                    <a:stretch>
+                      <a:fillRect/>
+                    </a:stretch>
+                  </pic:blipFill>
+                  <pic:spPr>
+                    <a:xfrm>
+                      <a:off x="0" y="0"/>
+                      <a:ext cx="7381240" cy="3522980"/>
+                    </a:xfrm>
+                    <a:prstGeom prst="rect">
+                      <a:avLst/>
+                    </a:prstGeom>
+                  </pic:spPr>
+                </pic:pic>
+              </a:graphicData>
+            </a:graphic>
+          </wp:inline>
+        </w:drawing>
+      </w:r>
+    </w:p>
+    <w:p>
+      <w:pPr>
+        <w:pStyle w:val="ListParagraph"/>
+        <w:spacing w:after="0"/>
+        <w:ind w:left="0"/>
+        <w:rPr>
+          <w:b/>
+          <w:bCs/>
+          <w:sz w:val="28"/>
+          <w:szCs w:val="28"/>
+        </w:rPr>
+      </w:pPr>
+      <w:r>
+        <w:rPr>
+          <w:b/>
+          <w:bCs/>
+          <w:sz w:val="28"/>
+          <w:szCs w:val="28"/>
+        </w:rPr>
+        <w:drawing>
+          <wp:inline distT="0" distB="0" distL="0" distR="0" wp14:anchorId="35E0F6B8" wp14:editId="61E11C21">
+            <wp:extent cx="7381240" cy="1225550"/>
+            <wp:effectExtent l="0" t="0" r="0" b="0"/>
+            <wp:docPr id="892191082" name="Picture 1"/>
+            <wp:cNvGraphicFramePr>
+              <a:graphicFrameLocks xmlns:a="http://schemas.openxmlformats.org/drawingml/2006/main" noChangeAspect="1"/>
+            </wp:cNvGraphicFramePr>
+            <a:graphic xmlns:a="http://schemas.openxmlformats.org/drawingml/2006/main">
+              <a:graphicData uri="http://schemas.openxmlformats.org/drawingml/2006/picture">
+                <pic:pic xmlns:pic="http://schemas.openxmlformats.org/drawingml/2006/picture">
+                  <pic:nvPicPr>
+                    <pic:cNvPr id="892191082" name=""/>
+                    <pic:cNvPicPr/>
+                  </pic:nvPicPr>
+                  <pic:blipFill>
+                    <a:blip r:embed="rId17"/>
+                    <a:stretch>
+                      <a:fillRect/>
+                    </a:stretch>
+                  </pic:blipFill>
+                  <pic:spPr>
+                    <a:xfrm>
+                      <a:off x="0" y="0"/>
+                      <a:ext cx="7381240" cy="1225550"/>
+                    </a:xfrm>
+                    <a:prstGeom prst="rect">
+                      <a:avLst/>
+                    </a:prstGeom>
+                  </pic:spPr>
+                </pic:pic>
+              </a:graphicData>
+            </a:graphic>
+          </wp:inline>
+        </w:drawing>
+      </w:r>
+    </w:p>
+    <w:p>
+      <w:pPr>
+        <w:pStyle w:val="ListParagraph"/>
+        <w:spacing w:after="0"/>
+        <w:ind w:left="0"/>
+        <w:rPr>
+          <w:b/>
+          <w:bCs/>
+          <w:sz w:val="28"/>
+          <w:szCs w:val="28"/>
+        </w:rPr>
+      </w:pPr>
+      <w:r>
+        <w:rPr>
+          <w:b/>
+          <w:bCs/>
+          <w:sz w:val="28"/>
+          <w:szCs w:val="28"/>
+        </w:rPr>
+        <w:drawing>
+          <wp:inline distT="0" distB="0" distL="0" distR="0" wp14:anchorId="356F0EFC" wp14:editId="7056520D">
+            <wp:extent cx="7381240" cy="1880235"/>
+            <wp:effectExtent l="0" t="0" r="0" b="5715"/>
+            <wp:docPr id="30232031" name="Picture 1"/>
+            <wp:cNvGraphicFramePr>
+              <a:graphicFrameLocks xmlns:a="http://schemas.openxmlformats.org/drawingml/2006/main" noChangeAspect="1"/>
+            </wp:cNvGraphicFramePr>
+            <a:graphic xmlns:a="http://schemas.openxmlformats.org/drawingml/2006/main">
+              <a:graphicData uri="http://schemas.openxmlformats.org/drawingml/2006/picture">
+                <pic:pic xmlns:pic="http://schemas.openxmlformats.org/drawingml/2006/picture">
+                  <pic:nvPicPr>
+                    <pic:cNvPr id="30232031" name=""/>
+                    <pic:cNvPicPr/>
+                  </pic:nvPicPr>
+                  <pic:blipFill>
+                    <a:blip r:embed="rId18"/>
+                    <a:stretch>
+                      <a:fillRect/>
+                    </a:stretch>
+                  </pic:blipFill>
+                  <pic:spPr>
+                    <a:xfrm>
+                      <a:off x="0" y="0"/>
+                      <a:ext cx="7381240" cy="1880235"/>
+                    </a:xfrm>
+                    <a:prstGeom prst="rect">
+                      <a:avLst/>
+                    </a:prstGeom>
+                  </pic:spPr>
+                </pic:pic>
+              </a:graphicData>
+            </a:graphic>
+          </wp:inline>
+        </w:drawing>
+      </w:r>
+    </w:p>
+    <w:p>
+      <w:pPr>
+        <w:pStyle w:val="ListParagraph"/>
+        <w:spacing w:after="0"/>
+        <w:ind w:left="0"/>
+        <w:rPr>
+          <w:b/>
+          <w:bCs/>
+          <w:sz w:val="28"/>
+          <w:szCs w:val="28"/>
+        </w:rPr>
+      </w:pPr>
+      <w:r>
+        <w:rPr>
+          <w:b/>
+          <w:bCs/>
+          <w:sz w:val="28"/>
+          <w:szCs w:val="28"/>
+        </w:rPr>
+        <w:drawing>
+          <wp:inline distT="0" distB="0" distL="0" distR="0" wp14:anchorId="6BA353FF" wp14:editId="5E7ABF10">
+            <wp:extent cx="7381240" cy="1625600"/>
+            <wp:effectExtent l="0" t="0" r="0" b="0"/>
+            <wp:docPr id="1220999456" name="Picture 1"/>
+            <wp:cNvGraphicFramePr>
+              <a:graphicFrameLocks xmlns:a="http://schemas.openxmlformats.org/drawingml/2006/main" noChangeAspect="1"/>
+            </wp:cNvGraphicFramePr>
+            <a:graphic xmlns:a="http://schemas.openxmlformats.org/drawingml/2006/main">
+              <a:graphicData uri="http://schemas.openxmlformats.org/drawingml/2006/picture">
+                <pic:pic xmlns:pic="http://schemas.openxmlformats.org/drawingml/2006/picture">
+                  <pic:nvPicPr>
+                    <pic:cNvPr id="1220999456" name=""/>
+                    <pic:cNvPicPr/>
+                  </pic:nvPicPr>
+                  <pic:blipFill>
+                    <a:blip r:embed="rId19"/>
+                    <a:stretch>
+                      <a:fillRect/>
+                    </a:stretch>
+                  </pic:blipFill>
+                  <pic:spPr>
+                    <a:xfrm>
+                      <a:off x="0" y="0"/>
+                      <a:ext cx="7381240" cy="1625600"/>
+                    </a:xfrm>
+                    <a:prstGeom prst="rect">
+                      <a:avLst/>
+                    </a:prstGeom>
+                  </pic:spPr>
+                </pic:pic>
+              </a:graphicData>
+            </a:graphic>
+          </wp:inline>
+        </w:drawing>
+      </w:r>
+    </w:p>
+    <w:p>
+      <w:pPr>
+        <w:pStyle w:val="ListParagraph"/>
+        <w:spacing w:after="0"/>
+        <w:ind w:left="0"/>
+        <w:rPr>
+          <w:b/>
+          <w:bCs/>
+          <w:sz w:val="28"/>
+          <w:szCs w:val="28"/>
+        </w:rPr>
+      </w:pPr>
+    </w:p>
+    <w:p>
+      <w:pPr>
+        <w:spacing w:after="0"/>
+        <w:rPr>
+          <w:b/>
+          <w:bCs/>
+          <w:sz w:val="28"/>
+          <w:szCs w:val="28"/>
+        </w:rPr>
+      </w:pPr>
+    </w:p>
+    <w:p>
+      <w:pPr>
+        <w:spacing w:after="0"/>
+        <w:rPr>
+          <w:b/>
+          <w:bCs/>
+          <w:sz w:val="28"/>
+          <w:szCs w:val="28"/>
+        </w:rPr>
+      </w:pPr>
+    </w:p>
+    <w:p>
+      <w:pPr>
+        <w:spacing w:after="0"/>
+        <w:rPr>
+          <w:b/>
+          <w:bCs/>
+          <w:sz w:val="28"/>
+          <w:szCs w:val="28"/>
+        </w:rPr>
+      </w:pPr>
+    </w:p>
+    <w:p>
+      <w:pPr>
+        <w:spacing w:after="0"/>
+        <w:rPr>
+          <w:b/>
+          <w:bCs/>
+          <w:sz w:val="28"/>
+          <w:szCs w:val="28"/>
+        </w:rPr>
+      </w:pPr>
+    </w:p>
+    <w:p>
+      <w:pPr>
+        <w:pStyle w:val="ListParagraph"/>
+        <w:numPr>
+          <w:ilvl w:val="0"/>
+          <w:numId w:val="1"/>
+        </w:numPr>
+        <w:spacing w:after="0"/>
+        <w:ind w:left="426" w:hanging="294"/>
+        <w:rPr>
+          <w:sz w:val="36"/>
+          <w:szCs w:val="36"/>
+        </w:rPr>
+      </w:pPr>
+      <w:r>
+        <w:rPr>
+          <w:sz w:val="36"/>
+          <w:szCs w:val="36"/>
+        </w:rPr>
+        <w:t xml:space="preserve">Configure poll </w:t>
+      </w:r>
+      <w:proofErr w:type="spellStart"/>
+      <w:r>
+        <w:rPr>
+          <w:sz w:val="36"/>
+          <w:szCs w:val="36"/>
+        </w:rPr>
+        <w:t>scm</w:t>
+      </w:r>
+      <w:proofErr w:type="spellEnd"/>
+      <w:r>
+        <w:rPr>
+          <w:sz w:val="36"/>
+          <w:szCs w:val="36"/>
+        </w:rPr>
+        <w:t xml:space="preserve"> and build periodical options in Jenkins job.</w:t>
+      </w:r>
+    </w:p>
+    <w:p>
+      <w:pPr>
+        <w:pStyle w:val="ListParagraph"/>
+        <w:spacing w:after="0"/>
+        <w:ind w:left="426"/>
+        <w:rPr>
+          <w:sz w:val="28"/>
+          <w:szCs w:val="28"/>
+        </w:rPr>
+      </w:pPr>
+      <w:r>
+        <w:rPr>
+          <w:sz w:val="28"/>
+          <w:szCs w:val="28"/>
+        </w:rPr>
+        <w:t xml:space="preserve">Step 1: </w:t>
+      </w:r>
+      <w:r>
+        <w:rPr>
+          <w:sz w:val="28"/>
+          <w:szCs w:val="28"/>
+        </w:rPr>
+        <w:t>Goto Jenkins</w:t>
+      </w:r>
+      <w:r>
+        <w:rPr>
+          <w:sz w:val="28"/>
+          <w:szCs w:val="28"/>
+        </w:rPr>
+        <w:sym w:font="Wingdings" w:char="F0E0"/>
+      </w:r>
+      <w:r>
+        <w:rPr>
+          <w:sz w:val="28"/>
+          <w:szCs w:val="28"/>
+        </w:rPr>
+        <w:t>Job</w:t>
+      </w:r>
+      <w:r>
+        <w:rPr>
+          <w:sz w:val="28"/>
+          <w:szCs w:val="28"/>
+        </w:rPr>
+        <w:sym w:font="Wingdings" w:char="F0E0"/>
+      </w:r>
+      <w:r>
+        <w:rPr>
+          <w:sz w:val="28"/>
+          <w:szCs w:val="28"/>
+        </w:rPr>
+        <w:t>configure</w:t>
+      </w:r>
+      <w:r>
+        <w:rPr>
+          <w:sz w:val="28"/>
+          <w:szCs w:val="28"/>
+        </w:rPr>
+        <w:sym w:font="Wingdings" w:char="F0E0"/>
+      </w:r>
+      <w:proofErr w:type="spellStart"/>
+      <w:r>
+        <w:rPr>
+          <w:sz w:val="28"/>
+          <w:szCs w:val="28"/>
+        </w:rPr>
+        <w:t>Trigers</w:t>
+      </w:r>
+      <w:proofErr w:type="spellEnd"/>
+      <w:r>
+        <w:rPr>
+          <w:sz w:val="28"/>
+          <w:szCs w:val="28"/>
+        </w:rPr>
+        <w:sym w:font="Wingdings" w:char="F0E0"/>
+      </w:r>
+      <w:r>
+        <w:rPr>
+          <w:sz w:val="28"/>
+          <w:szCs w:val="28"/>
+        </w:rPr>
+        <w:t>Poll SCM</w:t>
+      </w:r>
+      <w:r>
+        <w:rPr>
+          <w:sz w:val="28"/>
+          <w:szCs w:val="28"/>
+        </w:rPr>
+        <w:sym w:font="Wingdings" w:char="F0E0"/>
+      </w:r>
+      <w:r>
+        <w:rPr>
+          <w:sz w:val="28"/>
+          <w:szCs w:val="28"/>
+        </w:rPr>
+        <w:t>Schedule time to trigger the job</w:t>
+      </w:r>
+      <w:r>
+        <w:rPr>
+          <w:sz w:val="28"/>
+          <w:szCs w:val="28"/>
+        </w:rPr>
+        <w:sym w:font="Wingdings" w:char="F0E0"/>
+      </w:r>
+      <w:r>
+        <w:rPr>
+          <w:sz w:val="28"/>
+          <w:szCs w:val="28"/>
+        </w:rPr>
+        <w:t>save.</w:t>
+      </w:r>
+    </w:p>
+    <w:p>
+      <w:pPr>
+        <w:pStyle w:val="ListParagraph"/>
+        <w:spacing w:after="0"/>
+        <w:ind w:left="0"/>
+        <w:rPr>
+          <w:sz w:val="28"/>
+          <w:szCs w:val="28"/>
+        </w:rPr>
+      </w:pPr>
+      <w:r>
+        <w:rPr>
+          <w:sz w:val="28"/>
+          <w:szCs w:val="28"/>
+        </w:rPr>
+        <w:drawing>
+          <wp:inline distT="0" distB="0" distL="0" distR="0" wp14:anchorId="4C851FAA" wp14:editId="7F3145C5">
+            <wp:extent cx="7381240" cy="3663315"/>
+            <wp:effectExtent l="0" t="0" r="0" b="0"/>
+            <wp:docPr id="2052698342" name="Picture 1"/>
+            <wp:cNvGraphicFramePr>
+              <a:graphicFrameLocks xmlns:a="http://schemas.openxmlformats.org/drawingml/2006/main" noChangeAspect="1"/>
+            </wp:cNvGraphicFramePr>
+            <a:graphic xmlns:a="http://schemas.openxmlformats.org/drawingml/2006/main">
+              <a:graphicData uri="http://schemas.openxmlformats.org/drawingml/2006/picture">
+                <pic:pic xmlns:pic="http://schemas.openxmlformats.org/drawingml/2006/picture">
+                  <pic:nvPicPr>
+                    <pic:cNvPr id="2052698342" name=""/>
+                    <pic:cNvPicPr/>
+                  </pic:nvPicPr>
+                  <pic:blipFill>
+                    <a:blip r:embed="rId20"/>
+                    <a:stretch>
+                      <a:fillRect/>
+                    </a:stretch>
+                  </pic:blipFill>
+                  <pic:spPr>
+                    <a:xfrm>
+                      <a:off x="0" y="0"/>
+                      <a:ext cx="7381240" cy="3663315"/>
+                    </a:xfrm>
+                    <a:prstGeom prst="rect">
+                      <a:avLst/>
+                    </a:prstGeom>
+                  </pic:spPr>
+                </pic:pic>
+              </a:graphicData>
+            </a:graphic>
+          </wp:inline>
+        </w:drawing>
+      </w:r>
+    </w:p>
+    <w:p>
+      <w:pPr>
+        <w:spacing w:after="0"/>
+        <w:rPr>
+          <w:sz w:val="28"/>
+          <w:szCs w:val="28"/>
+        </w:rPr>
+      </w:pPr>
+      <w:r>
+        <w:rPr>
+          <w:sz w:val="28"/>
+          <w:szCs w:val="28"/>
+        </w:rPr>
+        <w:t xml:space="preserve">Step 2: </w:t>
+      </w:r>
+      <w:r>
+        <w:rPr>
+          <w:sz w:val="28"/>
+          <w:szCs w:val="28"/>
+        </w:rPr>
+        <w:t>Goto Jenkins</w:t>
+      </w:r>
+      <w:r>
+        <w:rPr>
+          <w:sz w:val="28"/>
+          <w:szCs w:val="28"/>
+        </w:rPr>
+        <w:sym w:font="Wingdings" w:char="F0E0"/>
+      </w:r>
+      <w:r>
+        <w:rPr>
+          <w:sz w:val="28"/>
+          <w:szCs w:val="28"/>
+        </w:rPr>
+        <w:t>Job</w:t>
+      </w:r>
+      <w:r>
+        <w:rPr>
+          <w:sz w:val="28"/>
+          <w:szCs w:val="28"/>
+        </w:rPr>
+        <w:sym w:font="Wingdings" w:char="F0E0"/>
+      </w:r>
+      <w:r>
+        <w:rPr>
+          <w:sz w:val="28"/>
+          <w:szCs w:val="28"/>
+        </w:rPr>
+        <w:t>configure</w:t>
+      </w:r>
+      <w:r>
+        <w:rPr>
+          <w:sz w:val="28"/>
+          <w:szCs w:val="28"/>
+        </w:rPr>
+        <w:sym w:font="Wingdings" w:char="F0E0"/>
+      </w:r>
+      <w:proofErr w:type="spellStart"/>
+      <w:r>
+        <w:rPr>
+          <w:sz w:val="28"/>
+          <w:szCs w:val="28"/>
+        </w:rPr>
+        <w:t>Trigers</w:t>
+      </w:r>
+      <w:proofErr w:type="spellEnd"/>
+      <w:r>
+        <w:rPr>
+          <w:sz w:val="28"/>
+          <w:szCs w:val="28"/>
+        </w:rPr>
+        <w:sym w:font="Wingdings" w:char="F0E0"/>
+      </w:r>
+      <w:r>
+        <w:rPr>
+          <w:sz w:val="28"/>
+          <w:szCs w:val="28"/>
+        </w:rPr>
+        <w:t>Build periodically</w:t>
+      </w:r>
+      <w:r>
+        <w:rPr>
+          <w:sz w:val="28"/>
+          <w:szCs w:val="28"/>
+        </w:rPr>
+        <w:sym w:font="Wingdings" w:char="F0E0"/>
+      </w:r>
+      <w:r>
+        <w:rPr>
+          <w:sz w:val="28"/>
+          <w:szCs w:val="28"/>
+        </w:rPr>
+        <w:t>Schedule time to trigger the job</w:t>
+      </w:r>
+      <w:r>
+        <w:rPr>
+          <w:sz w:val="28"/>
+          <w:szCs w:val="28"/>
+        </w:rPr>
+        <w:sym w:font="Wingdings" w:char="F0E0"/>
+      </w:r>
+      <w:r>
+        <w:rPr>
+          <w:sz w:val="28"/>
+          <w:szCs w:val="28"/>
+        </w:rPr>
+        <w:t>save.</w:t>
+      </w:r>
+    </w:p>
+    <w:p>
+      <w:pPr>
+        <w:spacing w:after="0"/>
+        <w:rPr>
+          <w:sz w:val="28"/>
+          <w:szCs w:val="28"/>
+        </w:rPr>
+      </w:pPr>
+      <w:r>
+        <w:rPr>
+          <w:sz w:val="28"/>
+          <w:szCs w:val="28"/>
+        </w:rPr>
+        <w:drawing>
+          <wp:inline distT="0" distB="0" distL="0" distR="0" wp14:anchorId="4BB08896" wp14:editId="1544580F">
+            <wp:extent cx="7381240" cy="3578860"/>
+            <wp:effectExtent l="0" t="0" r="0" b="2540"/>
+            <wp:docPr id="1876360158" name="Picture 1"/>
+            <wp:cNvGraphicFramePr>
+              <a:graphicFrameLocks xmlns:a="http://schemas.openxmlformats.org/drawingml/2006/main" noChangeAspect="1"/>
+            </wp:cNvGraphicFramePr>
+            <a:graphic xmlns:a="http://schemas.openxmlformats.org/drawingml/2006/main">
+              <a:graphicData uri="http://schemas.openxmlformats.org/drawingml/2006/picture">
+                <pic:pic xmlns:pic="http://schemas.openxmlformats.org/drawingml/2006/picture">
+                  <pic:nvPicPr>
+                    <pic:cNvPr id="1876360158" name=""/>
+                    <pic:cNvPicPr/>
+                  </pic:nvPicPr>
+                  <pic:blipFill>
+                    <a:blip r:embed="rId21"/>
+                    <a:stretch>
+                      <a:fillRect/>
+                    </a:stretch>
+                  </pic:blipFill>
+                  <pic:spPr>
+                    <a:xfrm>
+                      <a:off x="0" y="0"/>
+                      <a:ext cx="7381240" cy="3578860"/>
+                    </a:xfrm>
+                    <a:prstGeom prst="rect">
+                      <a:avLst/>
+                    </a:prstGeom>
+                  </pic:spPr>
+                </pic:pic>
+              </a:graphicData>
+            </a:graphic>
+          </wp:inline>
+        </w:drawing>
+      </w:r>
+    </w:p>
+    <w:p>
+      <w:pPr>
+        <w:tabs>
+          <w:tab w:val="left" w:pos="9665"/>
+        </w:tabs>
+        <w:rPr>
+          <w:sz w:val="28"/>
+          <w:szCs w:val="28"/>
+        </w:rPr>
+      </w:pPr>
+    </w:p>
+    <w:p>
+      <w:pPr>
+        <w:tabs>
+          <w:tab w:val="left" w:pos="9665"/>
+        </w:tabs>
+        <w:rPr>
+          <w:sz w:val="28"/>
+          <w:szCs w:val="28"/>
+        </w:rPr>
+      </w:pPr>
+    </w:p>
+    <w:p>
+      <w:pPr>
+        <w:tabs>
+          <w:tab w:val="left" w:pos="9665"/>
+        </w:tabs>
+        <w:rPr>
+          <w:sz w:val="28"/>
+          <w:szCs w:val="28"/>
+        </w:rPr>
+      </w:pPr>
+    </w:p>
+    <w:p>
+      <w:pPr>
+        <w:tabs>
+          <w:tab w:val="left" w:pos="9665"/>
+        </w:tabs>
+        <w:rPr>
+          <w:sz w:val="28"/>
+          <w:szCs w:val="28"/>
+        </w:rPr>
+      </w:pPr>
+    </w:p>
+    <w:p>
+      <w:pPr>
+        <w:tabs>
+          <w:tab w:val="left" w:pos="9665"/>
+        </w:tabs>
+        <w:rPr>
+          <w:sz w:val="28"/>
+          <w:szCs w:val="28"/>
+        </w:rPr>
+      </w:pPr>
+    </w:p>
+    <w:p>
+      <w:pPr>
+        <w:tabs>
+          <w:tab w:val="left" w:pos="9665"/>
+        </w:tabs>
+        <w:rPr>
+          <w:sz w:val="28"/>
+          <w:szCs w:val="28"/>
+        </w:rPr>
+      </w:pPr>
+    </w:p>
+    <w:p>
+      <w:pPr>
+        <w:pStyle w:val="ListParagraph"/>
+        <w:numPr>
+          <w:ilvl w:val="0"/>
+          <w:numId w:val="1"/>
+        </w:numPr>
+        <w:tabs>
+          <w:tab w:val="left" w:pos="9665"/>
+        </w:tabs>
+        <w:ind w:left="426" w:hanging="294"/>
+        <w:rPr>
+          <w:sz w:val="36"/>
+          <w:szCs w:val="36"/>
+        </w:rPr>
+      </w:pPr>
+      <w:r>
+        <w:rPr>
+          <w:sz w:val="36"/>
+          <w:szCs w:val="36"/>
+        </w:rPr>
+        <w:t>Take backup of Jenkins server by using bash script.</w:t>
+      </w:r>
+    </w:p>
+    <w:p>
+      <w:pPr>
+        <w:pStyle w:val="ListParagraph"/>
+        <w:tabs>
+          <w:tab w:val="left" w:pos="9665"/>
+        </w:tabs>
+        <w:ind w:left="426"/>
+        <w:rPr>
+          <w:sz w:val="28"/>
+          <w:szCs w:val="28"/>
+        </w:rPr>
+      </w:pPr>
+      <w:r>
+        <w:rPr>
+          <w:sz w:val="28"/>
+          <w:szCs w:val="28"/>
+        </w:rPr>
+        <w:t xml:space="preserve">Step 1: </w:t>
+      </w:r>
+      <w:r>
+        <w:rPr>
+          <w:sz w:val="28"/>
+          <w:szCs w:val="28"/>
+        </w:rPr>
+        <w:t>Create a bash script to take backup, give executable permission and execute the script.</w:t>
+      </w:r>
+    </w:p>
+    <w:p>
+      <w:pPr>
+        <w:pStyle w:val="ListParagraph"/>
+        <w:tabs>
+          <w:tab w:val="left" w:pos="9665"/>
+        </w:tabs>
+        <w:ind w:left="426"/>
+        <w:rPr>
+          <w:sz w:val="28"/>
+          <w:szCs w:val="28"/>
+        </w:rPr>
+      </w:pPr>
+      <w:r>
+        <w:rPr>
+          <w:sz w:val="28"/>
+          <w:szCs w:val="28"/>
+        </w:rPr>
+        <w:t xml:space="preserve">                </w:t>
+      </w:r>
+      <w:proofErr w:type="gramStart"/>
+      <w:r>
+        <w:rPr>
+          <w:sz w:val="28"/>
+          <w:szCs w:val="28"/>
+        </w:rPr>
+        <w:t>#!/</w:t>
+      </w:r>
+      <w:proofErr w:type="gramEnd"/>
+      <w:r>
+        <w:rPr>
+          <w:sz w:val="28"/>
+          <w:szCs w:val="28"/>
+        </w:rPr>
+        <w:t xml:space="preserve">bin/bash </w:t>
+      </w:r>
+    </w:p>
+    <w:p>
+      <w:pPr>
+        <w:pStyle w:val="ListParagraph"/>
+        <w:tabs>
+          <w:tab w:val="left" w:pos="9665"/>
+        </w:tabs>
+        <w:ind w:left="1440"/>
+        <w:rPr>
+          <w:sz w:val="28"/>
+          <w:szCs w:val="28"/>
+        </w:rPr>
+      </w:pPr>
+      <w:r>
+        <w:rPr>
+          <w:sz w:val="28"/>
+          <w:szCs w:val="28"/>
+        </w:rPr>
+        <w:t xml:space="preserve"># Variables </w:t>
+      </w:r>
+    </w:p>
+    <w:p>
+      <w:pPr>
+        <w:pStyle w:val="ListParagraph"/>
+        <w:tabs>
+          <w:tab w:val="left" w:pos="9665"/>
+        </w:tabs>
+        <w:ind w:left="1440"/>
+        <w:rPr>
+          <w:sz w:val="28"/>
+          <w:szCs w:val="28"/>
+        </w:rPr>
+      </w:pPr>
+      <w:r>
+        <w:rPr>
+          <w:sz w:val="28"/>
+          <w:szCs w:val="28"/>
+        </w:rPr>
+        <w:t>JENKINS_HOME="/var/lib/</w:t>
+      </w:r>
+      <w:proofErr w:type="spellStart"/>
+      <w:r>
+        <w:rPr>
+          <w:sz w:val="28"/>
+          <w:szCs w:val="28"/>
+        </w:rPr>
+        <w:t>jenkins</w:t>
+      </w:r>
+      <w:proofErr w:type="spellEnd"/>
+      <w:r>
+        <w:rPr>
+          <w:sz w:val="28"/>
+          <w:szCs w:val="28"/>
+        </w:rPr>
+        <w:t xml:space="preserve">" </w:t>
+      </w:r>
+    </w:p>
+    <w:p>
+      <w:pPr>
+        <w:pStyle w:val="ListParagraph"/>
+        <w:tabs>
+          <w:tab w:val="left" w:pos="9665"/>
+        </w:tabs>
+        <w:ind w:left="1440"/>
+        <w:rPr>
+          <w:sz w:val="28"/>
+          <w:szCs w:val="28"/>
+        </w:rPr>
+      </w:pPr>
+      <w:r>
+        <w:rPr>
+          <w:sz w:val="28"/>
+          <w:szCs w:val="28"/>
+        </w:rPr>
+        <w:t>BACKUP_DIR="/backup/</w:t>
+      </w:r>
+      <w:proofErr w:type="spellStart"/>
+      <w:r>
+        <w:rPr>
+          <w:sz w:val="28"/>
+          <w:szCs w:val="28"/>
+        </w:rPr>
+        <w:t>jenkins</w:t>
+      </w:r>
+      <w:proofErr w:type="spellEnd"/>
+      <w:r>
+        <w:rPr>
+          <w:sz w:val="28"/>
+          <w:szCs w:val="28"/>
+        </w:rPr>
+        <w:t xml:space="preserve">" </w:t>
+      </w:r>
+    </w:p>
+    <w:p>
+      <w:pPr>
+        <w:pStyle w:val="ListParagraph"/>
+        <w:tabs>
+          <w:tab w:val="left" w:pos="9665"/>
+        </w:tabs>
+        <w:ind w:left="1440"/>
+        <w:rPr>
+          <w:sz w:val="28"/>
+          <w:szCs w:val="28"/>
+        </w:rPr>
+      </w:pPr>
+      <w:r>
+        <w:rPr>
+          <w:sz w:val="28"/>
+          <w:szCs w:val="28"/>
+        </w:rPr>
+        <w:t>DATE=$(date +'%Y-%m-%</w:t>
+      </w:r>
+      <w:proofErr w:type="spellStart"/>
+      <w:r>
+        <w:rPr>
+          <w:sz w:val="28"/>
+          <w:szCs w:val="28"/>
+        </w:rPr>
+        <w:t>d_%H</w:t>
+      </w:r>
+      <w:proofErr w:type="spellEnd"/>
+      <w:r>
+        <w:rPr>
+          <w:sz w:val="28"/>
+          <w:szCs w:val="28"/>
+        </w:rPr>
+        <w:t xml:space="preserve">-%M-%S') </w:t>
+      </w:r>
+    </w:p>
+    <w:p>
+      <w:pPr>
+        <w:pStyle w:val="ListParagraph"/>
+        <w:tabs>
+          <w:tab w:val="left" w:pos="9665"/>
+        </w:tabs>
+        <w:ind w:left="1440"/>
+        <w:rPr>
+          <w:sz w:val="28"/>
+          <w:szCs w:val="28"/>
+        </w:rPr>
+      </w:pPr>
+      <w:r>
+        <w:rPr>
+          <w:sz w:val="28"/>
+          <w:szCs w:val="28"/>
+        </w:rPr>
+        <w:t xml:space="preserve">BACKUP_FILE="$BACKUP_DIR/jenkins_backup_$DATE.tar.gz" </w:t>
+      </w:r>
+    </w:p>
+    <w:p>
+      <w:pPr>
+        <w:pStyle w:val="ListParagraph"/>
+        <w:tabs>
+          <w:tab w:val="left" w:pos="9665"/>
+        </w:tabs>
+        <w:ind w:left="1440"/>
+        <w:rPr>
+          <w:sz w:val="28"/>
+          <w:szCs w:val="28"/>
+        </w:rPr>
+      </w:pPr>
+      <w:r>
+        <w:rPr>
+          <w:sz w:val="28"/>
+          <w:szCs w:val="28"/>
+        </w:rPr>
+        <w:t xml:space="preserve"># Create backup directory if not exists </w:t>
+      </w:r>
+    </w:p>
+    <w:p>
+      <w:pPr>
+        <w:pStyle w:val="ListParagraph"/>
+        <w:tabs>
+          <w:tab w:val="left" w:pos="9665"/>
+        </w:tabs>
+        <w:ind w:left="1440"/>
+        <w:rPr>
+          <w:sz w:val="28"/>
+          <w:szCs w:val="28"/>
+        </w:rPr>
+      </w:pPr>
+      <w:proofErr w:type="spellStart"/>
+      <w:r>
+        <w:rPr>
+          <w:sz w:val="28"/>
+          <w:szCs w:val="28"/>
+        </w:rPr>
+        <w:t>mkdir</w:t>
+      </w:r>
+      <w:proofErr w:type="spellEnd"/>
+      <w:r>
+        <w:rPr>
+          <w:sz w:val="28"/>
+          <w:szCs w:val="28"/>
+        </w:rPr>
+        <w:t xml:space="preserve"> -p "$BACKUP_DIR" </w:t>
+      </w:r>
+    </w:p>
+    <w:p>
+      <w:pPr>
+        <w:pStyle w:val="ListParagraph"/>
+        <w:tabs>
+          <w:tab w:val="left" w:pos="9665"/>
+        </w:tabs>
+        <w:ind w:left="1440"/>
+        <w:rPr>
+          <w:sz w:val="28"/>
+          <w:szCs w:val="28"/>
+        </w:rPr>
+      </w:pPr>
+      <w:r>
+        <w:rPr>
+          <w:sz w:val="28"/>
+          <w:szCs w:val="28"/>
+        </w:rPr>
+        <w:t xml:space="preserve"># Stop Jenkins service (optional but safer) </w:t>
+      </w:r>
+    </w:p>
+    <w:p>
+      <w:pPr>
+        <w:pStyle w:val="ListParagraph"/>
+        <w:tabs>
+          <w:tab w:val="left" w:pos="9665"/>
+        </w:tabs>
+        <w:ind w:left="1440"/>
+        <w:rPr>
+          <w:sz w:val="28"/>
+          <w:szCs w:val="28"/>
+        </w:rPr>
+      </w:pPr>
+      <w:r>
+        <w:rPr>
+          <w:sz w:val="28"/>
+          <w:szCs w:val="28"/>
+        </w:rPr>
+        <w:t xml:space="preserve">echo "Stopping Jenkins service..." </w:t>
+      </w:r>
+    </w:p>
+    <w:p>
+      <w:pPr>
+        <w:pStyle w:val="ListParagraph"/>
+        <w:tabs>
+          <w:tab w:val="left" w:pos="9665"/>
+        </w:tabs>
+        <w:ind w:left="1440"/>
+        <w:rPr>
+          <w:sz w:val="28"/>
+          <w:szCs w:val="28"/>
+        </w:rPr>
+      </w:pPr>
+      <w:proofErr w:type="spellStart"/>
+      <w:r>
+        <w:rPr>
+          <w:sz w:val="28"/>
+          <w:szCs w:val="28"/>
+        </w:rPr>
+        <w:t>systemctl</w:t>
+      </w:r>
+      <w:proofErr w:type="spellEnd"/>
+      <w:r>
+        <w:rPr>
+          <w:sz w:val="28"/>
+          <w:szCs w:val="28"/>
+        </w:rPr>
+        <w:t xml:space="preserve"> stop </w:t>
+      </w:r>
+      <w:proofErr w:type="spellStart"/>
+      <w:r>
+        <w:rPr>
+          <w:sz w:val="28"/>
+          <w:szCs w:val="28"/>
+        </w:rPr>
+        <w:t>jenkins</w:t>
+      </w:r>
+      <w:proofErr w:type="spellEnd"/>
+      <w:r>
+        <w:rPr>
+          <w:sz w:val="28"/>
+          <w:szCs w:val="28"/>
+        </w:rPr>
+        <w:t xml:space="preserve"> </w:t>
+      </w:r>
+    </w:p>
+    <w:p>
+      <w:pPr>
+        <w:pStyle w:val="ListParagraph"/>
+        <w:tabs>
+          <w:tab w:val="left" w:pos="9665"/>
+        </w:tabs>
+        <w:ind w:left="1440"/>
+        <w:rPr>
+          <w:sz w:val="28"/>
+          <w:szCs w:val="28"/>
+        </w:rPr>
+      </w:pPr>
+      <w:r>
+        <w:rPr>
+          <w:sz w:val="28"/>
+          <w:szCs w:val="28"/>
+        </w:rPr>
+        <w:t xml:space="preserve"># Take backup </w:t>
+      </w:r>
+    </w:p>
+    <w:p>
+      <w:pPr>
+        <w:pStyle w:val="ListParagraph"/>
+        <w:tabs>
+          <w:tab w:val="left" w:pos="9665"/>
+        </w:tabs>
+        <w:ind w:left="1440"/>
+        <w:rPr>
+          <w:sz w:val="28"/>
+          <w:szCs w:val="28"/>
+        </w:rPr>
+      </w:pPr>
+      <w:r>
+        <w:rPr>
+          <w:sz w:val="28"/>
+          <w:szCs w:val="28"/>
+        </w:rPr>
+        <w:t xml:space="preserve">echo "Taking backup of Jenkins directory..." </w:t>
+      </w:r>
+    </w:p>
+    <w:p>
+      <w:pPr>
+        <w:pStyle w:val="ListParagraph"/>
+        <w:tabs>
+          <w:tab w:val="left" w:pos="9665"/>
+        </w:tabs>
+        <w:ind w:left="1440"/>
+        <w:rPr>
+          <w:sz w:val="28"/>
+          <w:szCs w:val="28"/>
+        </w:rPr>
+      </w:pPr>
+      <w:r>
+        <w:rPr>
+          <w:sz w:val="28"/>
+          <w:szCs w:val="28"/>
+        </w:rPr>
+        <w:t>tar -</w:t>
+      </w:r>
+      <w:proofErr w:type="spellStart"/>
+      <w:r>
+        <w:rPr>
+          <w:sz w:val="28"/>
+          <w:szCs w:val="28"/>
+        </w:rPr>
+        <w:t>czvf</w:t>
+      </w:r>
+      <w:proofErr w:type="spellEnd"/>
+      <w:r>
+        <w:rPr>
+          <w:sz w:val="28"/>
+          <w:szCs w:val="28"/>
+        </w:rPr>
+        <w:t xml:space="preserve"> "$BACKUP_FILE" "$JENKINS_HOME" </w:t>
+      </w:r>
+    </w:p>
+    <w:p>
+      <w:pPr>
+        <w:pStyle w:val="ListParagraph"/>
+        <w:tabs>
+          <w:tab w:val="left" w:pos="9665"/>
+        </w:tabs>
+        <w:ind w:left="1440"/>
+        <w:rPr>
+          <w:sz w:val="28"/>
+          <w:szCs w:val="28"/>
+        </w:rPr>
+      </w:pPr>
+      <w:r>
+        <w:rPr>
+          <w:sz w:val="28"/>
+          <w:szCs w:val="28"/>
+        </w:rPr>
+        <w:t xml:space="preserve"># Start Jenkins service back </w:t>
+      </w:r>
+    </w:p>
+    <w:p>
+      <w:pPr>
+        <w:pStyle w:val="ListParagraph"/>
+        <w:tabs>
+          <w:tab w:val="left" w:pos="9665"/>
+        </w:tabs>
+        <w:ind w:left="1440"/>
+        <w:rPr>
+          <w:sz w:val="28"/>
+          <w:szCs w:val="28"/>
+        </w:rPr>
+      </w:pPr>
+      <w:r>
+        <w:rPr>
+          <w:sz w:val="28"/>
+          <w:szCs w:val="28"/>
+        </w:rPr>
+        <w:t xml:space="preserve">echo "Starting Jenkins service..." </w:t>
+      </w:r>
+    </w:p>
+    <w:p>
+      <w:pPr>
+        <w:pStyle w:val="ListParagraph"/>
+        <w:tabs>
+          <w:tab w:val="left" w:pos="9665"/>
+        </w:tabs>
+        <w:ind w:left="1440"/>
+        <w:rPr>
+          <w:sz w:val="28"/>
+          <w:szCs w:val="28"/>
+        </w:rPr>
+      </w:pPr>
+      <w:proofErr w:type="spellStart"/>
+      <w:r>
+        <w:rPr>
+          <w:sz w:val="28"/>
+          <w:szCs w:val="28"/>
+        </w:rPr>
+        <w:t>systemctl</w:t>
+      </w:r>
+      <w:proofErr w:type="spellEnd"/>
+      <w:r>
+        <w:rPr>
+          <w:sz w:val="28"/>
+          <w:szCs w:val="28"/>
+        </w:rPr>
+        <w:t xml:space="preserve"> start </w:t>
+      </w:r>
+      <w:proofErr w:type="spellStart"/>
+      <w:r>
+        <w:rPr>
+          <w:sz w:val="28"/>
+          <w:szCs w:val="28"/>
+        </w:rPr>
+        <w:t>jenkins</w:t>
+      </w:r>
+      <w:proofErr w:type="spellEnd"/>
+      <w:r>
+        <w:rPr>
+          <w:sz w:val="28"/>
+          <w:szCs w:val="28"/>
+        </w:rPr>
+        <w:t xml:space="preserve"> </w:t>
+      </w:r>
+    </w:p>
+    <w:p>
+      <w:pPr>
+        <w:pStyle w:val="ListParagraph"/>
+        <w:tabs>
+          <w:tab w:val="left" w:pos="9665"/>
+        </w:tabs>
+        <w:ind w:left="1440"/>
+        <w:rPr>
+          <w:sz w:val="28"/>
+          <w:szCs w:val="28"/>
+        </w:rPr>
+      </w:pPr>
+      <w:r>
+        <w:rPr>
+          <w:sz w:val="28"/>
+          <w:szCs w:val="28"/>
+        </w:rPr>
+        <w:t xml:space="preserve">echo "Backup completed successfully!" </w:t>
+      </w:r>
+    </w:p>
+    <w:p>
+      <w:pPr>
+        <w:pStyle w:val="ListParagraph"/>
+        <w:tabs>
+          <w:tab w:val="left" w:pos="9665"/>
+        </w:tabs>
+        <w:ind w:left="1440"/>
+        <w:rPr>
+          <w:sz w:val="28"/>
+          <w:szCs w:val="28"/>
+        </w:rPr>
+      </w:pPr>
+      <w:r>
+        <w:rPr>
+          <w:sz w:val="28"/>
+          <w:szCs w:val="28"/>
+        </w:rPr>
+        <w:t>echo "Backup file stored at: $BACKUP_FILE"</w:t>
+      </w:r>
+    </w:p>
+    <w:p>
+      <w:pPr>
+        <w:tabs>
+          <w:tab w:val="left" w:pos="9665"/>
+        </w:tabs>
+        <w:spacing w:after="0"/>
+        <w:rPr>
+          <w:sz w:val="28"/>
+          <w:szCs w:val="28"/>
+        </w:rPr>
+      </w:pPr>
+      <w:r>
+        <w:rPr>
+          <w:sz w:val="28"/>
+          <w:szCs w:val="28"/>
+        </w:rPr>
+        <w:drawing>
+          <wp:inline distT="0" distB="0" distL="0" distR="0" wp14:anchorId="526A4048" wp14:editId="5130F048">
+            <wp:extent cx="6516009" cy="1267002"/>
+            <wp:effectExtent l="0" t="0" r="0" b="9525"/>
+            <wp:docPr id="1109121253" name="Picture 1"/>
+            <wp:cNvGraphicFramePr>
+              <a:graphicFrameLocks xmlns:a="http://schemas.openxmlformats.org/drawingml/2006/main" noChangeAspect="1"/>
+            </wp:cNvGraphicFramePr>
+            <a:graphic xmlns:a="http://schemas.openxmlformats.org/drawingml/2006/main">
+              <a:graphicData uri="http://schemas.openxmlformats.org/drawingml/2006/picture">
+                <pic:pic xmlns:pic="http://schemas.openxmlformats.org/drawingml/2006/picture">
+                  <pic:nvPicPr>
+                    <pic:cNvPr id="1109121253" name=""/>
+                    <pic:cNvPicPr/>
+                  </pic:nvPicPr>
+                  <pic:blipFill>
+                    <a:blip r:embed="rId22"/>
+                    <a:stretch>
+                      <a:fillRect/>
+                    </a:stretch>
+                  </pic:blipFill>
+                  <pic:spPr>
+                    <a:xfrm>
+                      <a:off x="0" y="0"/>
+                      <a:ext cx="6516009" cy="1267002"/>
+                    </a:xfrm>
+                    <a:prstGeom prst="rect">
+                      <a:avLst/>
+                    </a:prstGeom>
+                  </pic:spPr>
+                </pic:pic>
+              </a:graphicData>
+            </a:graphic>
+          </wp:inline>
+        </w:drawing>
+      </w:r>
+    </w:p>
+    <w:p>
+      <w:pPr>
+        <w:tabs>
+          <w:tab w:val="left" w:pos="9665"/>
+        </w:tabs>
+        <w:spacing w:after="0"/>
+        <w:rPr>
+          <w:sz w:val="28"/>
+          <w:szCs w:val="28"/>
+        </w:rPr>
+      </w:pPr>
+      <w:r>
+        <w:rPr>
+          <w:sz w:val="28"/>
+          <w:szCs w:val="28"/>
+        </w:rPr>
+        <w:drawing>
+          <wp:inline distT="0" distB="0" distL="0" distR="0" wp14:anchorId="6B29C96F" wp14:editId="030CD950">
+            <wp:extent cx="5981700" cy="3669323"/>
+            <wp:effectExtent l="0" t="0" r="0" b="7620"/>
+            <wp:docPr id="238043129" name="Picture 1"/>
+            <wp:cNvGraphicFramePr>
+              <a:graphicFrameLocks xmlns:a="http://schemas.openxmlformats.org/drawingml/2006/main" noChangeAspect="1"/>
+            </wp:cNvGraphicFramePr>
+            <a:graphic xmlns:a="http://schemas.openxmlformats.org/drawingml/2006/main">
+              <a:graphicData uri="http://schemas.openxmlformats.org/drawingml/2006/picture">
+                <pic:pic xmlns:pic="http://schemas.openxmlformats.org/drawingml/2006/picture">
+                  <pic:nvPicPr>
+                    <pic:cNvPr id="238043129" name=""/>
+                    <pic:cNvPicPr/>
+                  </pic:nvPicPr>
+                  <pic:blipFill>
+                    <a:blip r:embed="rId23"/>
+                    <a:stretch>
+                      <a:fillRect/>
+                    </a:stretch>
+                  </pic:blipFill>
+                  <pic:spPr>
+                    <a:xfrm>
+                      <a:off x="0" y="0"/>
+                      <a:ext cx="5988363" cy="3673410"/>
+                    </a:xfrm>
+                    <a:prstGeom prst="rect">
+                      <a:avLst/>
+                    </a:prstGeom>
+                  </pic:spPr>
+                </pic:pic>
+              </a:graphicData>
+            </a:graphic>
+          </wp:inline>
+        </w:drawing>
+      </w:r>
+    </w:p>
+    <w:p>
+      <w:pPr>
+        <w:tabs>
+          <w:tab w:val="left" w:pos="9665"/>
+        </w:tabs>
+        <w:spacing w:after="0"/>
+        <w:rPr>
+          <w:sz w:val="28"/>
+          <w:szCs w:val="28"/>
+        </w:rPr>
+      </w:pPr>
+      <w:r>
+        <w:rPr>
+          <w:sz w:val="28"/>
+          <w:szCs w:val="28"/>
+        </w:rPr>
+        <w:lastRenderedPageBreak/>
+        <w:drawing>
+          <wp:inline distT="0" distB="0" distL="0" distR="0" wp14:anchorId="7AB2EE63" wp14:editId="2B2BDFBD">
+            <wp:extent cx="7381240" cy="1492885"/>
+            <wp:effectExtent l="0" t="0" r="0" b="0"/>
+            <wp:docPr id="416257" name="Picture 1"/>
+            <wp:cNvGraphicFramePr>
+              <a:graphicFrameLocks xmlns:a="http://schemas.openxmlformats.org/drawingml/2006/main" noChangeAspect="1"/>
+            </wp:cNvGraphicFramePr>
+            <a:graphic xmlns:a="http://schemas.openxmlformats.org/drawingml/2006/main">
+              <a:graphicData uri="http://schemas.openxmlformats.org/drawingml/2006/picture">
+                <pic:pic xmlns:pic="http://schemas.openxmlformats.org/drawingml/2006/picture">
+                  <pic:nvPicPr>
+                    <pic:cNvPr id="416257" name=""/>
+                    <pic:cNvPicPr/>
+                  </pic:nvPicPr>
+                  <pic:blipFill>
+                    <a:blip r:embed="rId24"/>
+                    <a:stretch>
+                      <a:fillRect/>
+                    </a:stretch>
+                  </pic:blipFill>
+                  <pic:spPr>
+                    <a:xfrm>
+                      <a:off x="0" y="0"/>
+                      <a:ext cx="7381240" cy="1492885"/>
+                    </a:xfrm>
+                    <a:prstGeom prst="rect">
+                      <a:avLst/>
+                    </a:prstGeom>
+                  </pic:spPr>
+                </pic:pic>
+              </a:graphicData>
+            </a:graphic>
+          </wp:inline>
+        </w:drawing>
+      </w:r>
+    </w:p>
+    <w:p>
+      <w:pPr>
+        <w:tabs>
+          <w:tab w:val="left" w:pos="9665"/>
+        </w:tabs>
+        <w:spacing w:after="0"/>
+        <w:rPr>
+          <w:sz w:val="28"/>
+          <w:szCs w:val="28"/>
+        </w:rPr>
+      </w:pPr>
+    </w:p>
+    <w:p>
+      <w:pPr>
+        <w:pStyle w:val="ListParagraph"/>
+        <w:numPr>
+          <w:ilvl w:val="0"/>
+          <w:numId w:val="1"/>
+        </w:numPr>
+        <w:tabs>
+          <w:tab w:val="left" w:pos="9665"/>
+        </w:tabs>
+        <w:spacing w:after="0"/>
+        <w:ind w:left="284" w:hanging="294"/>
+        <w:rPr>
+          <w:sz w:val="36"/>
+          <w:szCs w:val="36"/>
+        </w:rPr>
+      </w:pPr>
+      <w:r>
+        <w:rPr>
+          <w:sz w:val="36"/>
+          <w:szCs w:val="36"/>
+        </w:rPr>
+        <w:t xml:space="preserve">Take backup of Jenkins using </w:t>
+      </w:r>
+      <w:proofErr w:type="spellStart"/>
+      <w:r>
+        <w:rPr>
+          <w:sz w:val="36"/>
+          <w:szCs w:val="36"/>
+        </w:rPr>
+        <w:t>rethin</w:t>
+      </w:r>
+      <w:proofErr w:type="spellEnd"/>
+      <w:r>
+        <w:rPr>
+          <w:sz w:val="36"/>
+          <w:szCs w:val="36"/>
+        </w:rPr>
+        <w:t xml:space="preserve"> backup plugin.</w:t>
+      </w:r>
+    </w:p>
+    <w:p>
+      <w:pPr>
+        <w:pStyle w:val="ListParagraph"/>
+        <w:tabs>
+          <w:tab w:val="left" w:pos="9665"/>
+        </w:tabs>
+        <w:spacing w:after="0"/>
+        <w:ind w:left="284"/>
+        <w:rPr>
+          <w:sz w:val="28"/>
+          <w:szCs w:val="28"/>
+        </w:rPr>
+      </w:pPr>
+      <w:r>
+        <w:rPr>
+          <w:sz w:val="28"/>
+          <w:szCs w:val="28"/>
+        </w:rPr>
+        <w:t>Step 1: Goto Jenkins</w:t>
+      </w:r>
+      <w:r>
+        <w:rPr>
+          <w:sz w:val="28"/>
+          <w:szCs w:val="28"/>
+        </w:rPr>
+        <w:sym w:font="Wingdings" w:char="F0E0"/>
+      </w:r>
+      <w:r>
+        <w:rPr>
+          <w:sz w:val="28"/>
+          <w:szCs w:val="28"/>
+        </w:rPr>
+        <w:t>Manage Jenkins</w:t>
+      </w:r>
+      <w:r>
+        <w:rPr>
+          <w:sz w:val="28"/>
+          <w:szCs w:val="28"/>
+        </w:rPr>
+        <w:sym w:font="Wingdings" w:char="F0E0"/>
+      </w:r>
+      <w:r>
+        <w:rPr>
+          <w:sz w:val="28"/>
+          <w:szCs w:val="28"/>
+        </w:rPr>
+        <w:t>plugins</w:t>
+      </w:r>
+      <w:r>
+        <w:rPr>
+          <w:sz w:val="28"/>
+          <w:szCs w:val="28"/>
+        </w:rPr>
+        <w:sym w:font="Wingdings" w:char="F0E0"/>
+      </w:r>
+      <w:r>
+        <w:rPr>
+          <w:sz w:val="28"/>
+          <w:szCs w:val="28"/>
+        </w:rPr>
+        <w:t>available plugins</w:t>
+      </w:r>
+      <w:r>
+        <w:rPr>
+          <w:sz w:val="28"/>
+          <w:szCs w:val="28"/>
+        </w:rPr>
+        <w:sym w:font="Wingdings" w:char="F0E0"/>
+      </w:r>
+      <w:r>
+        <w:rPr>
+          <w:sz w:val="28"/>
+          <w:szCs w:val="28"/>
+        </w:rPr>
+        <w:t xml:space="preserve">search and install </w:t>
+      </w:r>
+      <w:proofErr w:type="spellStart"/>
+      <w:r>
+        <w:rPr>
+          <w:sz w:val="28"/>
+          <w:szCs w:val="28"/>
+        </w:rPr>
+        <w:t>thinbackup</w:t>
+      </w:r>
+      <w:proofErr w:type="spellEnd"/>
+    </w:p>
+    <w:p>
+      <w:pPr>
+        <w:tabs>
+          <w:tab w:val="left" w:pos="9665"/>
+        </w:tabs>
+        <w:spacing w:after="0"/>
+        <w:rPr>
+          <w:sz w:val="28"/>
+          <w:szCs w:val="28"/>
+        </w:rPr>
+      </w:pPr>
+      <w:r>
+        <w:rPr>
+          <w:sz w:val="28"/>
+          <w:szCs w:val="28"/>
+        </w:rPr>
+        <w:drawing>
+          <wp:inline distT="0" distB="0" distL="0" distR="0" wp14:anchorId="3EFEBFFC" wp14:editId="4C0CD252">
+            <wp:extent cx="7381240" cy="1518920"/>
+            <wp:effectExtent l="0" t="0" r="0" b="5080"/>
+            <wp:docPr id="693626764" name="Picture 1"/>
+            <wp:cNvGraphicFramePr>
+              <a:graphicFrameLocks xmlns:a="http://schemas.openxmlformats.org/drawingml/2006/main" noChangeAspect="1"/>
+            </wp:cNvGraphicFramePr>
+            <a:graphic xmlns:a="http://schemas.openxmlformats.org/drawingml/2006/main">
+              <a:graphicData uri="http://schemas.openxmlformats.org/drawingml/2006/picture">
+                <pic:pic xmlns:pic="http://schemas.openxmlformats.org/drawingml/2006/picture">
+                  <pic:nvPicPr>
+                    <pic:cNvPr id="693626764" name=""/>
+                    <pic:cNvPicPr/>
+                  </pic:nvPicPr>
+                  <pic:blipFill>
+                    <a:blip r:embed="rId25"/>
+                    <a:stretch>
+                      <a:fillRect/>
+                    </a:stretch>
+                  </pic:blipFill>
+                  <pic:spPr>
+                    <a:xfrm>
+                      <a:off x="0" y="0"/>
+                      <a:ext cx="7381240" cy="1518920"/>
+                    </a:xfrm>
+                    <a:prstGeom prst="rect">
+                      <a:avLst/>
+                    </a:prstGeom>
+                  </pic:spPr>
+                </pic:pic>
+              </a:graphicData>
+            </a:graphic>
+          </wp:inline>
+        </w:drawing>
+      </w:r>
+    </w:p>
+    <w:p>
+      <w:pPr>
+        <w:tabs>
+          <w:tab w:val="left" w:pos="9665"/>
+        </w:tabs>
+        <w:spacing w:after="0"/>
+        <w:rPr>
+          <w:sz w:val="28"/>
+          <w:szCs w:val="28"/>
+        </w:rPr>
+      </w:pPr>
+      <w:r>
+        <w:rPr>
+          <w:sz w:val="28"/>
+          <w:szCs w:val="28"/>
+        </w:rPr>
+        <w:drawing>
+          <wp:inline distT="0" distB="0" distL="0" distR="0" wp14:anchorId="64F66D27" wp14:editId="2643A29E">
+            <wp:extent cx="7381240" cy="1942465"/>
+            <wp:effectExtent l="0" t="0" r="0" b="635"/>
+            <wp:docPr id="1480629513" name="Picture 1"/>
+            <wp:cNvGraphicFramePr>
+              <a:graphicFrameLocks xmlns:a="http://schemas.openxmlformats.org/drawingml/2006/main" noChangeAspect="1"/>
+            </wp:cNvGraphicFramePr>
+            <a:graphic xmlns:a="http://schemas.openxmlformats.org/drawingml/2006/main">
+              <a:graphicData uri="http://schemas.openxmlformats.org/drawingml/2006/picture">
+                <pic:pic xmlns:pic="http://schemas.openxmlformats.org/drawingml/2006/picture">
+                  <pic:nvPicPr>
+                    <pic:cNvPr id="1480629513" name=""/>
+                    <pic:cNvPicPr/>
+                  </pic:nvPicPr>
+                  <pic:blipFill>
+                    <a:blip r:embed="rId26"/>
+                    <a:stretch>
+                      <a:fillRect/>
+                    </a:stretch>
+                  </pic:blipFill>
+                  <pic:spPr>
+                    <a:xfrm>
+                      <a:off x="0" y="0"/>
+                      <a:ext cx="7381240" cy="1942465"/>
+                    </a:xfrm>
+                    <a:prstGeom prst="rect">
+                      <a:avLst/>
+                    </a:prstGeom>
+                  </pic:spPr>
+                </pic:pic>
+              </a:graphicData>
+            </a:graphic>
+          </wp:inline>
+        </w:drawing>
+      </w:r>
+    </w:p>
+    <w:p>
+      <w:pPr>
+        <w:tabs>
+          <w:tab w:val="left" w:pos="9665"/>
+        </w:tabs>
+        <w:spacing w:after="0"/>
+        <w:rPr>
+          <w:sz w:val="28"/>
+          <w:szCs w:val="28"/>
+        </w:rPr>
+      </w:pPr>
+      <w:r>
+        <w:rPr>
+          <w:sz w:val="28"/>
+          <w:szCs w:val="28"/>
+        </w:rPr>
+        <w:t xml:space="preserve">Step 2: Goto Manage Jenkins </w:t>
+      </w:r>
+      <w:r>
+        <w:rPr>
+          <w:sz w:val="28"/>
+          <w:szCs w:val="28"/>
+        </w:rPr>
+        <w:sym w:font="Wingdings" w:char="F0E0"/>
+      </w:r>
+      <w:proofErr w:type="spellStart"/>
+      <w:r>
+        <w:rPr>
+          <w:sz w:val="28"/>
+          <w:szCs w:val="28"/>
+        </w:rPr>
+        <w:t>ThinBackup</w:t>
+      </w:r>
+      <w:proofErr w:type="spellEnd"/>
+      <w:r>
+        <w:rPr>
+          <w:sz w:val="28"/>
+          <w:szCs w:val="28"/>
+        </w:rPr>
+        <w:sym w:font="Wingdings" w:char="F0E0"/>
+      </w:r>
+      <w:r>
+        <w:rPr>
+          <w:sz w:val="28"/>
+          <w:szCs w:val="28"/>
+        </w:rPr>
+        <w:t>Click Backup now.</w:t>
+      </w:r>
+    </w:p>
+    <w:p>
+      <w:pPr>
+        <w:tabs>
+          <w:tab w:val="left" w:pos="9665"/>
+        </w:tabs>
+        <w:spacing w:after="0"/>
+        <w:rPr>
+          <w:sz w:val="28"/>
+          <w:szCs w:val="28"/>
+        </w:rPr>
+      </w:pPr>
+      <w:r>
+        <w:rPr>
+          <w:sz w:val="28"/>
+          <w:szCs w:val="28"/>
+        </w:rPr>
+        <w:drawing>
+          <wp:inline distT="0" distB="0" distL="0" distR="0" wp14:anchorId="5A824216" wp14:editId="72B7753C">
+            <wp:extent cx="7381240" cy="1406525"/>
+            <wp:effectExtent l="0" t="0" r="0" b="3175"/>
+            <wp:docPr id="2074064009" name="Picture 1"/>
+            <wp:cNvGraphicFramePr>
+              <a:graphicFrameLocks xmlns:a="http://schemas.openxmlformats.org/drawingml/2006/main" noChangeAspect="1"/>
+            </wp:cNvGraphicFramePr>
+            <a:graphic xmlns:a="http://schemas.openxmlformats.org/drawingml/2006/main">
+              <a:graphicData uri="http://schemas.openxmlformats.org/drawingml/2006/picture">
+                <pic:pic xmlns:pic="http://schemas.openxmlformats.org/drawingml/2006/picture">
+                  <pic:nvPicPr>
+                    <pic:cNvPr id="2074064009" name=""/>
+                    <pic:cNvPicPr/>
+                  </pic:nvPicPr>
+                  <pic:blipFill>
+                    <a:blip r:embed="rId27"/>
+                    <a:stretch>
+                      <a:fillRect/>
+                    </a:stretch>
+                  </pic:blipFill>
+                  <pic:spPr>
+                    <a:xfrm>
+                      <a:off x="0" y="0"/>
+                      <a:ext cx="7381240" cy="1406525"/>
+                    </a:xfrm>
+                    <a:prstGeom prst="rect">
+                      <a:avLst/>
+                    </a:prstGeom>
+                  </pic:spPr>
+                </pic:pic>
+              </a:graphicData>
+            </a:graphic>
+          </wp:inline>
+        </w:drawing>
+      </w:r>
+    </w:p>
+    <w:p>
+      <w:pPr>
+        <w:tabs>
+          <w:tab w:val="left" w:pos="9665"/>
+        </w:tabs>
+        <w:rPr>
+          <w:sz w:val="28"/>
+          <w:szCs w:val="28"/>
+        </w:rPr>
+      </w:pPr>
+    </w:p>
+    <w:p>
+      <w:pPr>
+        <w:pStyle w:val="ListParagraph"/>
+        <w:numPr>
+          <w:ilvl w:val="0"/>
+          <w:numId w:val="1"/>
+        </w:numPr>
+        <w:tabs>
+          <w:tab w:val="left" w:pos="9665"/>
+        </w:tabs>
+        <w:ind w:left="284" w:hanging="294"/>
+        <w:rPr>
+          <w:sz w:val="36"/>
+          <w:szCs w:val="36"/>
+        </w:rPr>
+      </w:pPr>
+      <w:r>
+        <w:rPr>
+          <w:sz w:val="36"/>
+          <w:szCs w:val="36"/>
+        </w:rPr>
+        <w:t>Setup a new Jenkins server and dump the backup taken in task4.</w:t>
+      </w:r>
+    </w:p>
+    <w:p>
+      <w:pPr>
+        <w:pStyle w:val="ListParagraph"/>
+        <w:tabs>
+          <w:tab w:val="left" w:pos="9665"/>
+        </w:tabs>
+        <w:ind w:left="284"/>
+        <w:rPr>
+          <w:sz w:val="28"/>
+          <w:szCs w:val="28"/>
+        </w:rPr>
+      </w:pPr>
+      <w:r>
+        <w:rPr>
+          <w:sz w:val="28"/>
+          <w:szCs w:val="28"/>
+        </w:rPr>
+        <w:t>Step 1: Launch a new instance.</w:t>
+      </w:r>
+    </w:p>
+    <w:p>
+      <w:pPr>
+        <w:tabs>
+          <w:tab w:val="left" w:pos="9665"/>
+        </w:tabs>
+        <w:rPr>
+          <w:sz w:val="28"/>
+          <w:szCs w:val="28"/>
+        </w:rPr>
+      </w:pPr>
+      <w:r>
+        <w:drawing>
+          <wp:inline distT="0" distB="0" distL="0" distR="0" wp14:anchorId="2E69B06F" wp14:editId="1CFA4DE6">
+            <wp:extent cx="7381240" cy="1386840"/>
+            <wp:effectExtent l="0" t="0" r="0" b="3810"/>
+            <wp:docPr id="1259142430" name="Picture 1"/>
+            <wp:cNvGraphicFramePr>
+              <a:graphicFrameLocks xmlns:a="http://schemas.openxmlformats.org/drawingml/2006/main" noChangeAspect="1"/>
+            </wp:cNvGraphicFramePr>
+            <a:graphic xmlns:a="http://schemas.openxmlformats.org/drawingml/2006/main">
+              <a:graphicData uri="http://schemas.openxmlformats.org/drawingml/2006/picture">
+                <pic:pic xmlns:pic="http://schemas.openxmlformats.org/drawingml/2006/picture">
+                  <pic:nvPicPr>
+                    <pic:cNvPr id="1259142430" name=""/>
+                    <pic:cNvPicPr/>
+                  </pic:nvPicPr>
+                  <pic:blipFill>
+                    <a:blip r:embed="rId28"/>
+                    <a:stretch>
+                      <a:fillRect/>
+                    </a:stretch>
+                  </pic:blipFill>
+                  <pic:spPr>
+                    <a:xfrm>
+                      <a:off x="0" y="0"/>
+                      <a:ext cx="7381240" cy="1386840"/>
+                    </a:xfrm>
+                    <a:prstGeom prst="rect">
+                      <a:avLst/>
+                    </a:prstGeom>
+                  </pic:spPr>
+                </pic:pic>
+              </a:graphicData>
+            </a:graphic>
+          </wp:inline>
+        </w:drawing>
+      </w:r>
+    </w:p>
+    <w:p>
+      <w:pPr>
+        <w:tabs>
+          <w:tab w:val="left" w:pos="9665"/>
+        </w:tabs>
+        <w:rPr>
+          <w:sz w:val="28"/>
+          <w:szCs w:val="28"/>
+        </w:rPr>
+      </w:pPr>
+    </w:p>
+    <w:p>
+      <w:pPr>
+        <w:tabs>
+          <w:tab w:val="left" w:pos="9665"/>
+        </w:tabs>
+        <w:rPr>
+          <w:sz w:val="28"/>
+          <w:szCs w:val="28"/>
+        </w:rPr>
+      </w:pPr>
+    </w:p>
+    <w:p>
+      <w:pPr>
+        <w:tabs>
+          <w:tab w:val="left" w:pos="9665"/>
+        </w:tabs>
+        <w:rPr>
+          <w:sz w:val="28"/>
+          <w:szCs w:val="28"/>
+        </w:rPr>
+      </w:pPr>
+      <w:r>
+        <w:rPr>
+          <w:sz w:val="28"/>
+          <w:szCs w:val="28"/>
+        </w:rPr>
+        <w:lastRenderedPageBreak/>
+        <w:t xml:space="preserve">     Step 2: Login to the instance where the backup is.</w:t>
+      </w:r>
+    </w:p>
+    <w:p>
+      <w:pPr>
+        <w:tabs>
+          <w:tab w:val="left" w:pos="9665"/>
+        </w:tabs>
+        <w:rPr>
+          <w:sz w:val="28"/>
+          <w:szCs w:val="28"/>
+        </w:rPr>
+      </w:pPr>
+      <w:r>
+        <w:rPr>
+          <w:sz w:val="28"/>
+          <w:szCs w:val="28"/>
+        </w:rPr>
+        <w:drawing>
+          <wp:inline distT="0" distB="0" distL="0" distR="0" wp14:anchorId="74FBC51F" wp14:editId="1CD4841C">
+            <wp:extent cx="7381240" cy="2287270"/>
+            <wp:effectExtent l="0" t="0" r="0" b="0"/>
+            <wp:docPr id="1425289453" name="Picture 1"/>
+            <wp:cNvGraphicFramePr>
+              <a:graphicFrameLocks xmlns:a="http://schemas.openxmlformats.org/drawingml/2006/main" noChangeAspect="1"/>
+            </wp:cNvGraphicFramePr>
+            <a:graphic xmlns:a="http://schemas.openxmlformats.org/drawingml/2006/main">
+              <a:graphicData uri="http://schemas.openxmlformats.org/drawingml/2006/picture">
+                <pic:pic xmlns:pic="http://schemas.openxmlformats.org/drawingml/2006/picture">
+                  <pic:nvPicPr>
+                    <pic:cNvPr id="1425289453" name=""/>
+                    <pic:cNvPicPr/>
+                  </pic:nvPicPr>
+                  <pic:blipFill>
+                    <a:blip r:embed="rId29"/>
+                    <a:stretch>
+                      <a:fillRect/>
+                    </a:stretch>
+                  </pic:blipFill>
+                  <pic:spPr>
+                    <a:xfrm>
+                      <a:off x="0" y="0"/>
+                      <a:ext cx="7381240" cy="2287270"/>
+                    </a:xfrm>
+                    <a:prstGeom prst="rect">
+                      <a:avLst/>
+                    </a:prstGeom>
+                  </pic:spPr>
+                </pic:pic>
+              </a:graphicData>
+            </a:graphic>
+          </wp:inline>
+        </w:drawing>
+      </w:r>
+    </w:p>
+    <w:p>
+      <w:pPr>
+        <w:tabs>
+          <w:tab w:val="left" w:pos="9665"/>
+        </w:tabs>
+        <w:spacing w:after="0"/>
+        <w:rPr>
+          <w:sz w:val="28"/>
+          <w:szCs w:val="28"/>
+        </w:rPr>
+      </w:pPr>
+      <w:r>
+        <w:rPr>
+          <w:sz w:val="28"/>
+          <w:szCs w:val="28"/>
+        </w:rPr>
+        <w:t xml:space="preserve">Step 3: Take a copy </w:t>
+      </w:r>
+      <w:proofErr w:type="gramStart"/>
+      <w:r>
+        <w:rPr>
+          <w:sz w:val="28"/>
+          <w:szCs w:val="28"/>
+        </w:rPr>
+        <w:t>of .</w:t>
+      </w:r>
+      <w:proofErr w:type="spellStart"/>
+      <w:r>
+        <w:rPr>
+          <w:sz w:val="28"/>
+          <w:szCs w:val="28"/>
+        </w:rPr>
+        <w:t>pem</w:t>
+      </w:r>
+      <w:proofErr w:type="spellEnd"/>
+      <w:proofErr w:type="gramEnd"/>
+      <w:r>
+        <w:rPr>
+          <w:sz w:val="28"/>
+          <w:szCs w:val="28"/>
+        </w:rPr>
+        <w:t xml:space="preserve"> key of new instance and make a file in this instance</w:t>
+      </w:r>
+      <w:r>
+        <w:rPr>
+          <w:sz w:val="28"/>
+          <w:szCs w:val="28"/>
+        </w:rPr>
+        <w:t xml:space="preserve"> and give permission</w:t>
+      </w:r>
+      <w:r>
+        <w:rPr>
+          <w:sz w:val="28"/>
+          <w:szCs w:val="28"/>
+        </w:rPr>
+        <w:t>.</w:t>
+      </w:r>
+    </w:p>
+    <w:p>
+      <w:pPr>
+        <w:tabs>
+          <w:tab w:val="left" w:pos="9665"/>
+        </w:tabs>
+        <w:spacing w:after="0"/>
+        <w:rPr>
+          <w:sz w:val="28"/>
+          <w:szCs w:val="28"/>
+        </w:rPr>
+      </w:pPr>
+      <w:r>
+        <w:rPr>
+          <w:sz w:val="28"/>
+          <w:szCs w:val="28"/>
+        </w:rPr>
+        <w:drawing>
+          <wp:inline distT="0" distB="0" distL="0" distR="0" wp14:anchorId="6C5C97D0" wp14:editId="5658EC3B">
+            <wp:extent cx="7381240" cy="1377950"/>
+            <wp:effectExtent l="0" t="0" r="0" b="0"/>
+            <wp:docPr id="2131746543" name="Picture 1"/>
+            <wp:cNvGraphicFramePr>
+              <a:graphicFrameLocks xmlns:a="http://schemas.openxmlformats.org/drawingml/2006/main" noChangeAspect="1"/>
+            </wp:cNvGraphicFramePr>
+            <a:graphic xmlns:a="http://schemas.openxmlformats.org/drawingml/2006/main">
+              <a:graphicData uri="http://schemas.openxmlformats.org/drawingml/2006/picture">
+                <pic:pic xmlns:pic="http://schemas.openxmlformats.org/drawingml/2006/picture">
+                  <pic:nvPicPr>
+                    <pic:cNvPr id="2131746543" name=""/>
+                    <pic:cNvPicPr/>
+                  </pic:nvPicPr>
+                  <pic:blipFill>
+                    <a:blip r:embed="rId30"/>
+                    <a:stretch>
+                      <a:fillRect/>
+                    </a:stretch>
+                  </pic:blipFill>
+                  <pic:spPr>
+                    <a:xfrm>
+                      <a:off x="0" y="0"/>
+                      <a:ext cx="7381240" cy="1377950"/>
+                    </a:xfrm>
+                    <a:prstGeom prst="rect">
+                      <a:avLst/>
+                    </a:prstGeom>
+                  </pic:spPr>
+                </pic:pic>
+              </a:graphicData>
+            </a:graphic>
+          </wp:inline>
+        </w:drawing>
+      </w:r>
+    </w:p>
+    <w:p>
+      <w:pPr>
+        <w:tabs>
+          <w:tab w:val="left" w:pos="9665"/>
+        </w:tabs>
+        <w:spacing w:after="0"/>
+        <w:rPr>
+          <w:sz w:val="28"/>
+          <w:szCs w:val="28"/>
+        </w:rPr>
+      </w:pPr>
+      <w:r>
+        <w:rPr>
+          <w:sz w:val="28"/>
+          <w:szCs w:val="28"/>
+        </w:rPr>
+        <w:t xml:space="preserve">Step 4: </w:t>
+      </w:r>
+      <w:r>
+        <w:rPr>
+          <w:sz w:val="28"/>
+          <w:szCs w:val="28"/>
+        </w:rPr>
+        <w:t xml:space="preserve">Now execute </w:t>
+      </w:r>
+      <w:proofErr w:type="spellStart"/>
+      <w:r>
+        <w:rPr>
+          <w:b/>
+          <w:bCs/>
+          <w:sz w:val="28"/>
+          <w:szCs w:val="28"/>
+        </w:rPr>
+        <w:t>scp</w:t>
+      </w:r>
+      <w:proofErr w:type="spellEnd"/>
+      <w:r>
+        <w:rPr>
+          <w:b/>
+          <w:bCs/>
+          <w:sz w:val="28"/>
+          <w:szCs w:val="28"/>
+        </w:rPr>
+        <w:t xml:space="preserve"> -</w:t>
+      </w:r>
+      <w:proofErr w:type="spellStart"/>
+      <w:r>
+        <w:rPr>
+          <w:b/>
+          <w:bCs/>
+          <w:sz w:val="28"/>
+          <w:szCs w:val="28"/>
+        </w:rPr>
+        <w:t>i</w:t>
+      </w:r>
+      <w:proofErr w:type="spellEnd"/>
+      <w:r>
+        <w:rPr>
+          <w:b/>
+          <w:bCs/>
+          <w:sz w:val="28"/>
+          <w:szCs w:val="28"/>
+        </w:rPr>
+        <w:t xml:space="preserve"> </w:t>
+      </w:r>
+      <w:proofErr w:type="spellStart"/>
+      <w:r>
+        <w:rPr>
+          <w:b/>
+          <w:bCs/>
+          <w:sz w:val="28"/>
+          <w:szCs w:val="28"/>
+        </w:rPr>
+        <w:t>security_key.pem</w:t>
+      </w:r>
+      <w:proofErr w:type="spellEnd"/>
+      <w:r>
+        <w:rPr>
+          <w:b/>
+          <w:bCs/>
+          <w:sz w:val="28"/>
+          <w:szCs w:val="28"/>
+        </w:rPr>
+        <w:t xml:space="preserve"> file.tar ec2-user@public_ip:/</w:t>
+      </w:r>
+      <w:proofErr w:type="spellStart"/>
+      <w:r>
+        <w:rPr>
+          <w:b/>
+          <w:bCs/>
+          <w:sz w:val="28"/>
+          <w:szCs w:val="28"/>
+        </w:rPr>
+        <w:t>tmp</w:t>
+      </w:r>
+      <w:proofErr w:type="spellEnd"/>
+      <w:r>
+        <w:rPr>
+          <w:b/>
+          <w:bCs/>
+          <w:sz w:val="28"/>
+          <w:szCs w:val="28"/>
+        </w:rPr>
+        <w:t xml:space="preserve"> </w:t>
+      </w:r>
+      <w:r>
+        <w:rPr>
+          <w:sz w:val="28"/>
+          <w:szCs w:val="28"/>
+        </w:rPr>
+        <w:t>to send backup file to new server.</w:t>
+      </w:r>
+    </w:p>
+    <w:p>
+      <w:pPr>
+        <w:tabs>
+          <w:tab w:val="left" w:pos="9665"/>
+        </w:tabs>
+        <w:spacing w:after="0"/>
+        <w:rPr>
+          <w:sz w:val="28"/>
+          <w:szCs w:val="28"/>
+        </w:rPr>
+      </w:pPr>
+      <w:r>
+        <w:rPr>
+          <w:sz w:val="28"/>
+          <w:szCs w:val="28"/>
+        </w:rPr>
+        <w:drawing>
+          <wp:inline distT="0" distB="0" distL="0" distR="0" wp14:anchorId="66EF2892" wp14:editId="2CCCECE0">
+            <wp:extent cx="7381240" cy="1031631"/>
+            <wp:effectExtent l="0" t="0" r="0" b="0"/>
+            <wp:docPr id="52171960" name="Picture 1"/>
+            <wp:cNvGraphicFramePr>
+              <a:graphicFrameLocks xmlns:a="http://schemas.openxmlformats.org/drawingml/2006/main" noChangeAspect="1"/>
+            </wp:cNvGraphicFramePr>
+            <a:graphic xmlns:a="http://schemas.openxmlformats.org/drawingml/2006/main">
+              <a:graphicData uri="http://schemas.openxmlformats.org/drawingml/2006/picture">
+                <pic:pic xmlns:pic="http://schemas.openxmlformats.org/drawingml/2006/picture">
+                  <pic:nvPicPr>
+                    <pic:cNvPr id="52171960" name=""/>
+                    <pic:cNvPicPr/>
+                  </pic:nvPicPr>
+                  <pic:blipFill>
+                    <a:blip r:embed="rId31"/>
+                    <a:stretch>
+                      <a:fillRect/>
+                    </a:stretch>
+                  </pic:blipFill>
+                  <pic:spPr>
+                    <a:xfrm>
+                      <a:off x="0" y="0"/>
+                      <a:ext cx="7427285" cy="1038066"/>
+                    </a:xfrm>
+                    <a:prstGeom prst="rect">
+                      <a:avLst/>
+                    </a:prstGeom>
+                  </pic:spPr>
+                </pic:pic>
+              </a:graphicData>
+            </a:graphic>
+          </wp:inline>
+        </w:drawing>
+      </w:r>
+    </w:p>
+    <w:p>
+      <w:pPr>
+        <w:tabs>
+          <w:tab w:val="left" w:pos="9665"/>
+        </w:tabs>
+        <w:spacing w:after="0"/>
+        <w:rPr>
+          <w:sz w:val="28"/>
+          <w:szCs w:val="28"/>
+        </w:rPr>
+      </w:pPr>
+      <w:r>
+        <w:rPr>
+          <w:sz w:val="28"/>
+          <w:szCs w:val="28"/>
+        </w:rPr>
+        <w:t>Step 2: Login to new server, move the backup file to /var/lib/Jenkins and extract it.</w:t>
+      </w:r>
+    </w:p>
+    <w:p>
+      <w:pPr>
+        <w:tabs>
+          <w:tab w:val="left" w:pos="9665"/>
+        </w:tabs>
+        <w:spacing w:after="0"/>
+        <w:rPr>
+          <w:sz w:val="28"/>
+          <w:szCs w:val="28"/>
+        </w:rPr>
+      </w:pPr>
+      <w:r>
+        <w:rPr>
+          <w:sz w:val="28"/>
+          <w:szCs w:val="28"/>
+        </w:rPr>
+        <w:drawing>
+          <wp:inline distT="0" distB="0" distL="0" distR="0" wp14:anchorId="3266A6CA" wp14:editId="045971FD">
+            <wp:extent cx="7381240" cy="1184031"/>
+            <wp:effectExtent l="0" t="0" r="0" b="0"/>
+            <wp:docPr id="1506310401" name="Picture 1"/>
+            <wp:cNvGraphicFramePr>
+              <a:graphicFrameLocks xmlns:a="http://schemas.openxmlformats.org/drawingml/2006/main" noChangeAspect="1"/>
+            </wp:cNvGraphicFramePr>
+            <a:graphic xmlns:a="http://schemas.openxmlformats.org/drawingml/2006/main">
+              <a:graphicData uri="http://schemas.openxmlformats.org/drawingml/2006/picture">
+                <pic:pic xmlns:pic="http://schemas.openxmlformats.org/drawingml/2006/picture">
+                  <pic:nvPicPr>
+                    <pic:cNvPr id="1506310401" name=""/>
+                    <pic:cNvPicPr/>
+                  </pic:nvPicPr>
+                  <pic:blipFill>
+                    <a:blip r:embed="rId32"/>
+                    <a:stretch>
+                      <a:fillRect/>
+                    </a:stretch>
+                  </pic:blipFill>
+                  <pic:spPr>
+                    <a:xfrm>
+                      <a:off x="0" y="0"/>
+                      <a:ext cx="7397560" cy="1186649"/>
+                    </a:xfrm>
+                    <a:prstGeom prst="rect">
+                      <a:avLst/>
+                    </a:prstGeom>
+                  </pic:spPr>
+                </pic:pic>
+              </a:graphicData>
+            </a:graphic>
+          </wp:inline>
+        </w:drawing>
+      </w:r>
+    </w:p>
+    <w:p>
+      <w:pPr>
+        <w:tabs>
+          <w:tab w:val="left" w:pos="9665"/>
+        </w:tabs>
+        <w:spacing w:after="0"/>
+        <w:rPr>
+          <w:sz w:val="28"/>
+          <w:szCs w:val="28"/>
+        </w:rPr>
+      </w:pPr>
+      <w:r>
+        <w:rPr>
+          <w:sz w:val="28"/>
+          <w:szCs w:val="28"/>
+        </w:rPr>
+        <w:drawing>
+          <wp:inline distT="0" distB="0" distL="0" distR="0" wp14:anchorId="4B43FC12" wp14:editId="0EAAA5D8">
+            <wp:extent cx="7381240" cy="2501265"/>
+            <wp:effectExtent l="0" t="0" r="0" b="0"/>
+            <wp:docPr id="666494045" name="Picture 1"/>
+            <wp:cNvGraphicFramePr>
+              <a:graphicFrameLocks xmlns:a="http://schemas.openxmlformats.org/drawingml/2006/main" noChangeAspect="1"/>
+            </wp:cNvGraphicFramePr>
+            <a:graphic xmlns:a="http://schemas.openxmlformats.org/drawingml/2006/main">
+              <a:graphicData uri="http://schemas.openxmlformats.org/drawingml/2006/picture">
+                <pic:pic xmlns:pic="http://schemas.openxmlformats.org/drawingml/2006/picture">
+                  <pic:nvPicPr>
+                    <pic:cNvPr id="666494045" name=""/>
+                    <pic:cNvPicPr/>
+                  </pic:nvPicPr>
+                  <pic:blipFill>
+                    <a:blip r:embed="rId33"/>
+                    <a:stretch>
+                      <a:fillRect/>
+                    </a:stretch>
+                  </pic:blipFill>
+                  <pic:spPr>
+                    <a:xfrm>
+                      <a:off x="0" y="0"/>
+                      <a:ext cx="7381240" cy="2501265"/>
+                    </a:xfrm>
+                    <a:prstGeom prst="rect">
+                      <a:avLst/>
+                    </a:prstGeom>
+                  </pic:spPr>
+                </pic:pic>
+              </a:graphicData>
+            </a:graphic>
+          </wp:inline>
+        </w:drawing>
+      </w:r>
+    </w:p>
+    <w:p>
+      <w:pPr>
+        <w:tabs>
+          <w:tab w:val="left" w:pos="9665"/>
+        </w:tabs>
+        <w:spacing w:after="0"/>
+        <w:rPr>
+          <w:sz w:val="28"/>
+          <w:szCs w:val="28"/>
+        </w:rPr>
+      </w:pPr>
+    </w:p>
+    <w:p>
+      <w:pPr>
+        <w:tabs>
+          <w:tab w:val="left" w:pos="9665"/>
+        </w:tabs>
+        <w:spacing w:after="0"/>
+        <w:rPr>
           <w:sz w:val="28"/>
           <w:szCs w:val="28"/>
         </w:rPr>

</xml_diff>